<commit_message>
docs: update comprehensive project documentation docx with Gemini AI, GitHub repo, APK, and latest feature additions
</commit_message>
<xml_diff>
--- a/CallMate_AI_Complete_Project_Documentation.docx
+++ b/CallMate_AI_Complete_Project_Documentation.docx
@@ -78,10 +78,30 @@
               <w:rPr>
                 <w:b/>
               </w:rPr>
+              <w:t xml:space="preserve">GitHub Repository: </w:t>
+            </w:r>
+            <w:r>
+              <w:t>https://github.com/sanjana71006/CallAgent</w:t>
+              <w:br/>
+            </w:r>
+            <w:r>
+              <w:rPr>
+                <w:b/>
+              </w:rPr>
+              <w:t xml:space="preserve">150-Char Synopsis: </w:t>
+            </w:r>
+            <w:r>
+              <w:t>CallMate AI is a privacy-first call assistant that screens unknown calls, transcribes voice live, blocks spam, and guides couriers with Google Gemini.</w:t>
+              <w:br/>
+            </w:r>
+            <w:r>
+              <w:rPr>
+                <w:b/>
+              </w:rPr>
               <w:t xml:space="preserve">Version: </w:t>
             </w:r>
             <w:r>
-              <w:t>v1.0.0 (Build 2026081841)</w:t>
+              <w:t>v1.0.0 (Release Build 2026081841 - CallMate_AI_v1.0.0_debug.apk)</w:t>
               <w:br/>
             </w:r>
             <w:r>
@@ -101,7 +121,7 @@
               <w:t xml:space="preserve">Architecture Scope: </w:t>
             </w:r>
             <w:r>
-              <w:t>Android Client (Kotlin/Compose/Room) + Cloud Backend (Node.js/Express/MongoDB Atlas) + AI Engine (FastAPI/Ollama)</w:t>
+              <w:t>Android Client (Kotlin/Compose/Room) + Cloud Backend (Node.js/Express/MongoDB Atlas) + AI Engine (FastAPI/Google Gemini 3.6 Flash)</w:t>
               <w:br/>
             </w:r>
             <w:r>
@@ -140,7 +160,7 @@
         <w:spacing w:line="276" w:lineRule="auto"/>
       </w:pPr>
       <w:r>
-        <w:t>This document provides a factual, exhaustive, and rigorously verified technical record of the CallMate AI system. CallMate AI is an intelligent call management and screening platform engineered with an offline-first Android client (Kotlin, Jetpack Compose, Room + SQLite), a cloud authentication and account management backend (Node.js, Express, MongoDB Atlas), and an AI call screening inference server (Python FastAPI with local Ollama LLM integration). Every section in this document describes the precise state of the codebase, strictly differentiating implemented features from partially implemented modules and planned future work.</w:t>
+        <w:t>This document provides a factual, exhaustive, and rigorously verified technical record of the CallMate AI system. CallMate AI is an intelligent call management and screening platform engineered with an offline-first Android client (Kotlin, Jetpack Compose, Room + SQLite), a cloud authentication, crowdsourced spam, and address database (Node.js, Express, MongoDB Atlas), and an AI call screening inference server (Python FastAPI with Google Gemini 3.6 Flash integration). Every section in this document describes the precise state of the codebase, strictly differentiating implemented features from partially implemented modules and planned future work.</w:t>
       </w:r>
     </w:p>
     <w:p>
@@ -8322,7 +8342,7 @@
         <w:rPr>
           <w:color w:val="0F172A"/>
         </w:rPr>
-        <w:t xml:space="preserve"> users (stores registered user accounts and authentication credentials)</w:t>
+        <w:t xml:space="preserve"> users (stores registered profiles, GPS location, courier addresses, instructions, and settings), spamnumbers (global community threat database)</w:t>
       </w:r>
     </w:p>
     <w:p>
@@ -8341,7 +8361,7 @@
         <w:rPr>
           <w:color w:val="0F172A"/>
         </w:rPr>
-        <w:t xml:space="preserve"> email_1 (unique index for fast lookup and duplicate prevention), userId_1 (unique indexed UUID)</w:t>
+        <w:t xml:space="preserve"> users.email_1 (unique), users.userId_1 (unique), spamnumbers.phoneNumber_1 (unique indexed phone)</w:t>
       </w:r>
     </w:p>
     <w:p>
@@ -8369,7 +8389,7 @@
           <w:color w:val="0F172A"/>
           <w:sz w:val="21"/>
         </w:rPr>
-        <w:t>Below is the verified JSON document structure for the users collection:</w:t>
+        <w:t>Below is the verified JSON document structure for the users and spamnumbers collections in MongoDB Atlas:</w:t>
       </w:r>
     </w:p>
     <w:tbl>
@@ -8404,6 +8424,8 @@
                 <w:color w:val="F1F5F9"/>
                 <w:sz w:val="18"/>
               </w:rPr>
+              <w:t>// Collection: users</w:t>
+              <w:br/>
               <w:t>{</w:t>
               <w:br/>
               <w:t xml:space="preserve">  "_id": "66ce381a89f41b120c89a4e2",</w:t>
@@ -8414,23 +8436,96 @@
               <w:br/>
               <w:t xml:space="preserve">  "email": "sanjana@callmate.ai",</w:t>
               <w:br/>
-              <w:t xml:space="preserve">  "password": "$2a$10$7vN3XGg5d9u1b.k8wP2qEe6h1Y8j3kL4m5n6o7p8q9r0s1t2u3v4w",</w:t>
+              <w:t xml:space="preserve">  "phoneNumber": "+919440886543",</w:t>
               <w:br/>
-              <w:t xml:space="preserve">  "passwordHash": "$2a$10$7vN3XGg5d9u1b.k8wP2qEe6h1Y8j3kL4m5n6o7p8q9r0s1t2u3v4w",</w:t>
+              <w:t xml:space="preserve">  "gender": "Female",</w:t>
               <w:br/>
-              <w:t xml:space="preserve">  "phoneNumber": "+919440886543",</w:t>
+              <w:t xml:space="preserve">  "location": {</w:t>
+              <w:br/>
+              <w:t xml:space="preserve">    "latitude": 16.2888,</w:t>
+              <w:br/>
+              <w:t xml:space="preserve">    "longitude": 80.4256,</w:t>
+              <w:br/>
+              <w:t xml:space="preserve">    "address": "Hanuman Nagar, Guntur, Andhra Pradesh, 522001, India",</w:t>
+              <w:br/>
+              <w:t xml:space="preserve">    "accuracy": 241,</w:t>
+              <w:br/>
+              <w:t xml:space="preserve">    "updatedAt": "2026-08-31T16:00:36.000Z"</w:t>
+              <w:br/>
+              <w:t xml:space="preserve">  },</w:t>
+              <w:br/>
+              <w:t xml:space="preserve">  "addresses": [</w:t>
+              <w:br/>
+              <w:t xml:space="preserve">    {</w:t>
+              <w:br/>
+              <w:t xml:space="preserve">      "id": "addr_live_auto",</w:t>
+              <w:br/>
+              <w:t xml:space="preserve">      "label": "📍 Live Current Location",</w:t>
+              <w:br/>
+              <w:t xml:space="preserve">      "fullAddress": "Hanuman Nagar, Guntur, Andhra Pradesh, 522001, India",</w:t>
+              <w:br/>
+              <w:t xml:space="preserve">      "coordinates": { "lat": 16.2888, "lng": 80.4256 }</w:t>
+              <w:br/>
+              <w:t xml:space="preserve">    },</w:t>
+              <w:br/>
+              <w:t xml:space="preserve">    {</w:t>
+              <w:br/>
+              <w:t xml:space="preserve">      "id": "addr_892348",</w:t>
+              <w:br/>
+              <w:t xml:space="preserve">      "label": "🏢 Work Hub",</w:t>
+              <w:br/>
+              <w:t xml:space="preserve">      "fullAddress": "Tower 4, Mindspace Tech Park, HITEC City, Hyderabad",</w:t>
+              <w:br/>
+              <w:t xml:space="preserve">      "additionalDetails": "Drop at 5th floor reception"</w:t>
+              <w:br/>
+              <w:t xml:space="preserve">    }</w:t>
+              <w:br/>
+              <w:t xml:space="preserve">  ],</w:t>
+              <w:br/>
+              <w:t xml:space="preserve">  "instructions": [</w:t>
+              <w:br/>
+              <w:t xml:space="preserve">    {</w:t>
+              <w:br/>
+              <w:t xml:space="preserve">      "id": "inst_1",</w:t>
+              <w:br/>
+              <w:t xml:space="preserve">      "title": "Delivery Couriers",</w:t>
+              <w:br/>
+              <w:t xml:space="preserve">      "prompt": "Ask for delivery package tracking number and tell driver to leave parcel at front door.",</w:t>
+              <w:br/>
+              <w:t xml:space="preserve">      "enabled": true</w:t>
+              <w:br/>
+              <w:t xml:space="preserve">    }</w:t>
+              <w:br/>
+              <w:t xml:space="preserve">  ],</w:t>
               <w:br/>
               <w:t xml:space="preserve">  "accountStatus": "ACTIVE",</w:t>
               <w:br/>
-              <w:t xml:space="preserve">  "appVersion": "1.0.0",</w:t>
-              <w:br/>
-              <w:t xml:space="preserve">  "lastLogin": "2026-08-31T15:04:33.957Z",</w:t>
-              <w:br/>
               <w:t xml:space="preserve">  "createdAt": "2026-08-27T16:32:17.346Z",</w:t>
               <w:br/>
-              <w:t xml:space="preserve">  "updatedAt": "2026-08-31T15:04:33.957Z",</w:t>
+              <w:t xml:space="preserve">  "updatedAt": "2026-08-31T16:00:36.000Z"</w:t>
               <w:br/>
-              <w:t xml:space="preserve">  "__v": 0</w:t>
+              <w:t>}</w:t>
+              <w:br/>
+              <w:br/>
+              <w:t>// Collection: spamnumbers (Crowdsourced Threat Database)</w:t>
+              <w:br/>
+              <w:t>{</w:t>
+              <w:br/>
+              <w:t xml:space="preserve">  "_id": "66ce89b21f98e2340b12a991",</w:t>
+              <w:br/>
+              <w:t xml:space="preserve">  "phoneNumber": "+1 (555) 382-9012",</w:t>
+              <w:br/>
+              <w:t xml:space="preserve">  "reportCount": 14,</w:t>
+              <w:br/>
+              <w:t xml:space="preserve">  "spamScore": 92,</w:t>
+              <w:br/>
+              <w:t xml:space="preserve">  "category": "FINANCIAL_SCAM",</w:t>
+              <w:br/>
+              <w:t xml:space="preserve">  "callerName": "Bajaj Quick Loan Agent",</w:t>
+              <w:br/>
+              <w:t xml:space="preserve">  "reporters": ["usr_aee79ffe-8888-4601-8f79-c9e9c535e810"],</w:t>
+              <w:br/>
+              <w:t xml:space="preserve">  "lastReportedAt": "2026-08-31T15:49:18.950Z"</w:t>
               <w:br/>
               <w:t>}</w:t>
             </w:r>
@@ -8518,36 +8613,27 @@
               <w:t>db.users.findOne({ email: "sanjana@callmate.ai" }, { password: 0, passwordHash: 0 });</w:t>
               <w:br/>
               <w:br/>
-              <w:t>// 4. Count active registered users</w:t>
+              <w:t>// 4. Query live location &amp; addresses</w:t>
               <w:br/>
-              <w:t>db.users.countDocuments({ accountStatus: "ACTIVE" });</w:t>
+              <w:t>db.users.find({ email: "sanjana@callmate.ai" }, { location: 1, addresses: 1 });</w:t>
               <w:br/>
               <w:br/>
-              <w:t>// 5. Update user phone number</w:t>
+              <w:t>// 5. Query crowdsourced spam numbers with report count &gt;= 5</w:t>
               <w:br/>
-              <w:t>db.users.updateOne(</w:t>
+              <w:t>db.spamnumbers.find({ reportCount: { $gte: 5 } }).sort({ reportCount: -1 });</w:t>
               <w:br/>
-              <w:t xml:space="preserve">  { userId: "usr_aee79ffe-8888-4601-8f79-c9e9c535e810" },</w:t>
               <w:br/>
-              <w:t xml:space="preserve">  { $set: { phoneNumber: "+919440886543", updatedAt: new Date() } }</w:t>
+              <w:t>// 6. Report/Increment spam score for a telephone number</w:t>
+              <w:br/>
+              <w:t>db.spamnumbers.updateOne(</w:t>
+              <w:br/>
+              <w:t xml:space="preserve">  { phoneNumber: "+15553829012" },</w:t>
+              <w:br/>
+              <w:t xml:space="preserve">  { $inc: { reportCount: 1, spamScore: 5 }, $set: { lastReportedAt: new Date() } },</w:t>
+              <w:br/>
+              <w:t xml:space="preserve">  { upsert: true }</w:t>
               <w:br/>
               <w:t>);</w:t>
-              <w:br/>
-              <w:br/>
-              <w:t>// 6. Soft-delete user account</w:t>
-              <w:br/>
-              <w:t>db.users.updateOne(</w:t>
-              <w:br/>
-              <w:t xml:space="preserve">  { email: "user@example.com" },</w:t>
-              <w:br/>
-              <w:t xml:space="preserve">  { $set: { accountStatus: "DELETED", updatedAt: new Date() } }</w:t>
-              <w:br/>
-              <w:t>);</w:t>
-              <w:br/>
-              <w:br/>
-              <w:t>// 7. [CAUTION: DESTRUCTIVE] Permanently remove user by userId</w:t>
-              <w:br/>
-              <w:t>db.users.deleteOne({ userId: "usr_aee79ffe-8888-4601-8f79-c9e9c535e810" });</w:t>
             </w:r>
           </w:p>
         </w:tc>
@@ -9341,7 +9427,7 @@
                 <w:color w:val="0F172A"/>
                 <w:sz w:val="19"/>
               </w:rPr>
-              <w:t>Updates Name or Phone. Body: {name, phoneNumber}</w:t>
+              <w:t>Updates Name, Phone, Gender. Body: {name, phoneNumber, gender}</w:t>
             </w:r>
           </w:p>
         </w:tc>
@@ -9371,7 +9457,7 @@
                 <w:color w:val="0F172A"/>
                 <w:sz w:val="19"/>
               </w:rPr>
-              <w:t>DELETE</w:t>
+              <w:t>PUT</w:t>
             </w:r>
           </w:p>
         </w:tc>
@@ -9396,7 +9482,7 @@
                 <w:color w:val="0F172A"/>
                 <w:sz w:val="19"/>
               </w:rPr>
-              <w:t>/api/users/me</w:t>
+              <w:t>/api/users/location</w:t>
             </w:r>
           </w:p>
         </w:tc>
@@ -9446,7 +9532,7 @@
                 <w:color w:val="0F172A"/>
                 <w:sz w:val="19"/>
               </w:rPr>
-              <w:t>Permanently deletes user account from MongoDB Atlas</w:t>
+              <w:t>Updates GPS &amp; auto-reverse geocoded street address. Body: {latitude, longitude, address, accuracy}</w:t>
             </w:r>
           </w:p>
         </w:tc>
@@ -9501,7 +9587,7 @@
                 <w:color w:val="0F172A"/>
                 <w:sz w:val="19"/>
               </w:rPr>
-              <w:t>/api/health</w:t>
+              <w:t>/api/users/addresses</w:t>
             </w:r>
           </w:p>
         </w:tc>
@@ -9526,7 +9612,7 @@
                 <w:color w:val="0F172A"/>
                 <w:sz w:val="19"/>
               </w:rPr>
-              <w:t>No</w:t>
+              <w:t>Bearer</w:t>
             </w:r>
           </w:p>
         </w:tc>
@@ -9551,7 +9637,7 @@
                 <w:color w:val="0F172A"/>
                 <w:sz w:val="19"/>
               </w:rPr>
-              <w:t>System health check returning database status and uptime</w:t>
+              <w:t>Fetches all saved courier drop-off addresses from MongoDB Atlas</w:t>
             </w:r>
           </w:p>
         </w:tc>
@@ -9606,7 +9692,7 @@
                 <w:color w:val="0F172A"/>
                 <w:sz w:val="19"/>
               </w:rPr>
-              <w:t>/api/v1/ai/chat</w:t>
+              <w:t>/api/users/addresses</w:t>
             </w:r>
           </w:p>
         </w:tc>
@@ -9631,7 +9717,7 @@
                 <w:color w:val="0F172A"/>
                 <w:sz w:val="19"/>
               </w:rPr>
-              <w:t>No</w:t>
+              <w:t>Bearer</w:t>
             </w:r>
           </w:p>
         </w:tc>
@@ -9656,7 +9742,7 @@
                 <w:color w:val="0F172A"/>
                 <w:sz w:val="19"/>
               </w:rPr>
-              <w:t>Generates screening reply. Body: {call_id, conversation}</w:t>
+              <w:t>Saves new delivery address to MongoDB. Body: {label, fullAddress, additionalDetails}</w:t>
             </w:r>
           </w:p>
         </w:tc>
@@ -9686,7 +9772,7 @@
                 <w:color w:val="0F172A"/>
                 <w:sz w:val="19"/>
               </w:rPr>
-              <w:t>POST</w:t>
+              <w:t>DELETE</w:t>
             </w:r>
           </w:p>
         </w:tc>
@@ -9711,7 +9797,7 @@
                 <w:color w:val="0F172A"/>
                 <w:sz w:val="19"/>
               </w:rPr>
-              <w:t>/api/v1/ai/classify</w:t>
+              <w:t>/api/users/addresses/:id</w:t>
             </w:r>
           </w:p>
         </w:tc>
@@ -9736,7 +9822,7 @@
                 <w:color w:val="0F172A"/>
                 <w:sz w:val="19"/>
               </w:rPr>
-              <w:t>No</w:t>
+              <w:t>Bearer</w:t>
             </w:r>
           </w:p>
         </w:tc>
@@ -9761,7 +9847,7 @@
                 <w:color w:val="0F172A"/>
                 <w:sz w:val="19"/>
               </w:rPr>
-              <w:t>Classifies call category and intent. Body: {call_id, conversation}</w:t>
+              <w:t>Removes saved address from MongoDB Atlas</w:t>
             </w:r>
           </w:p>
         </w:tc>
@@ -9816,7 +9902,7 @@
                 <w:color w:val="0F172A"/>
                 <w:sz w:val="19"/>
               </w:rPr>
-              <w:t>/api/v1/ai/summarize</w:t>
+              <w:t>/api/users/instructions</w:t>
             </w:r>
           </w:p>
         </w:tc>
@@ -9841,7 +9927,7 @@
                 <w:color w:val="0F172A"/>
                 <w:sz w:val="19"/>
               </w:rPr>
-              <w:t>No</w:t>
+              <w:t>Bearer</w:t>
             </w:r>
           </w:p>
         </w:tc>
@@ -9866,7 +9952,7 @@
                 <w:color w:val="0F172A"/>
                 <w:sz w:val="19"/>
               </w:rPr>
-              <w:t>Generates post-call structured summary. Body: {call_id, conversation, caller_name}</w:t>
+              <w:t>Saves custom AI screening rule. Body: {title, prompt, tag}</w:t>
             </w:r>
           </w:p>
         </w:tc>
@@ -9896,7 +9982,7 @@
                 <w:color w:val="0F172A"/>
                 <w:sz w:val="19"/>
               </w:rPr>
-              <w:t>GET</w:t>
+              <w:t>DELETE</w:t>
             </w:r>
           </w:p>
         </w:tc>
@@ -9921,7 +10007,7 @@
                 <w:color w:val="0F172A"/>
                 <w:sz w:val="19"/>
               </w:rPr>
-              <w:t>/api/v1/health</w:t>
+              <w:t>/api/users/instructions/:id</w:t>
             </w:r>
           </w:p>
         </w:tc>
@@ -9946,7 +10032,7 @@
                 <w:color w:val="0F172A"/>
                 <w:sz w:val="19"/>
               </w:rPr>
-              <w:t>No</w:t>
+              <w:t>Bearer</w:t>
             </w:r>
           </w:p>
         </w:tc>
@@ -9971,7 +10057,847 @@
                 <w:color w:val="0F172A"/>
                 <w:sz w:val="19"/>
               </w:rPr>
-              <w:t>FastAPI health check with AI provider status and latency</w:t>
+              <w:t>Removes screening rule from cloud</w:t>
+            </w:r>
+          </w:p>
+        </w:tc>
+      </w:tr>
+      <w:tr>
+        <w:trPr>
+          <w:cantSplit/>
+        </w:trPr>
+        <w:tc>
+          <w:tcPr>
+            <w:tcW w:type="dxa" w:w="1440"/>
+            <w:shd w:fill="FFFFFF"/>
+            <w:tcMar>
+              <w:top w:w="100" w:type="dxa"/>
+              <w:bottom w:w="100" w:type="dxa"/>
+              <w:left w:w="120" w:type="dxa"/>
+              <w:right w:w="120" w:type="dxa"/>
+            </w:tcMar>
+          </w:tcPr>
+          <w:p>
+            <w:pPr>
+              <w:spacing w:after="0" w:line="264" w:lineRule="auto"/>
+            </w:pPr>
+            <w:r>
+              <w:rPr>
+                <w:rFonts w:ascii="Calibri" w:hAnsi="Calibri"/>
+                <w:color w:val="0F172A"/>
+                <w:sz w:val="19"/>
+              </w:rPr>
+              <w:t>POST</w:t>
+            </w:r>
+          </w:p>
+        </w:tc>
+        <w:tc>
+          <w:tcPr>
+            <w:tcW w:type="dxa" w:w="2880"/>
+            <w:shd w:fill="FFFFFF"/>
+            <w:tcMar>
+              <w:top w:w="100" w:type="dxa"/>
+              <w:bottom w:w="100" w:type="dxa"/>
+              <w:left w:w="120" w:type="dxa"/>
+              <w:right w:w="120" w:type="dxa"/>
+            </w:tcMar>
+          </w:tcPr>
+          <w:p>
+            <w:pPr>
+              <w:spacing w:after="0" w:line="264" w:lineRule="auto"/>
+            </w:pPr>
+            <w:r>
+              <w:rPr>
+                <w:rFonts w:ascii="Calibri" w:hAnsi="Calibri"/>
+                <w:color w:val="0F172A"/>
+                <w:sz w:val="19"/>
+              </w:rPr>
+              <w:t>/api/spam/report</w:t>
+            </w:r>
+          </w:p>
+        </w:tc>
+        <w:tc>
+          <w:tcPr>
+            <w:tcW w:type="dxa" w:w="1584"/>
+            <w:shd w:fill="FFFFFF"/>
+            <w:tcMar>
+              <w:top w:w="100" w:type="dxa"/>
+              <w:bottom w:w="100" w:type="dxa"/>
+              <w:left w:w="120" w:type="dxa"/>
+              <w:right w:w="120" w:type="dxa"/>
+            </w:tcMar>
+          </w:tcPr>
+          <w:p>
+            <w:pPr>
+              <w:spacing w:after="0" w:line="264" w:lineRule="auto"/>
+            </w:pPr>
+            <w:r>
+              <w:rPr>
+                <w:rFonts w:ascii="Calibri" w:hAnsi="Calibri"/>
+                <w:color w:val="0F172A"/>
+                <w:sz w:val="19"/>
+              </w:rPr>
+              <w:t>Bearer</w:t>
+            </w:r>
+          </w:p>
+        </w:tc>
+        <w:tc>
+          <w:tcPr>
+            <w:tcW w:type="dxa" w:w="3456"/>
+            <w:shd w:fill="FFFFFF"/>
+            <w:tcMar>
+              <w:top w:w="100" w:type="dxa"/>
+              <w:bottom w:w="100" w:type="dxa"/>
+              <w:left w:w="120" w:type="dxa"/>
+              <w:right w:w="120" w:type="dxa"/>
+            </w:tcMar>
+          </w:tcPr>
+          <w:p>
+            <w:pPr>
+              <w:spacing w:after="0" w:line="264" w:lineRule="auto"/>
+            </w:pPr>
+            <w:r>
+              <w:rPr>
+                <w:rFonts w:ascii="Calibri" w:hAnsi="Calibri"/>
+                <w:color w:val="0F172A"/>
+                <w:sz w:val="19"/>
+              </w:rPr>
+              <w:t>Reports number to global community spam database. Body: {phoneNumber, category, reason}</w:t>
+            </w:r>
+          </w:p>
+        </w:tc>
+      </w:tr>
+      <w:tr>
+        <w:trPr>
+          <w:cantSplit/>
+        </w:trPr>
+        <w:tc>
+          <w:tcPr>
+            <w:tcW w:type="dxa" w:w="1440"/>
+            <w:shd w:fill="F8FAFC"/>
+            <w:tcMar>
+              <w:top w:w="100" w:type="dxa"/>
+              <w:bottom w:w="100" w:type="dxa"/>
+              <w:left w:w="120" w:type="dxa"/>
+              <w:right w:w="120" w:type="dxa"/>
+            </w:tcMar>
+          </w:tcPr>
+          <w:p>
+            <w:pPr>
+              <w:spacing w:after="0" w:line="264" w:lineRule="auto"/>
+            </w:pPr>
+            <w:r>
+              <w:rPr>
+                <w:rFonts w:ascii="Calibri" w:hAnsi="Calibri"/>
+                <w:color w:val="0F172A"/>
+                <w:sz w:val="19"/>
+              </w:rPr>
+              <w:t>GET</w:t>
+            </w:r>
+          </w:p>
+        </w:tc>
+        <w:tc>
+          <w:tcPr>
+            <w:tcW w:type="dxa" w:w="2880"/>
+            <w:shd w:fill="F8FAFC"/>
+            <w:tcMar>
+              <w:top w:w="100" w:type="dxa"/>
+              <w:bottom w:w="100" w:type="dxa"/>
+              <w:left w:w="120" w:type="dxa"/>
+              <w:right w:w="120" w:type="dxa"/>
+            </w:tcMar>
+          </w:tcPr>
+          <w:p>
+            <w:pPr>
+              <w:spacing w:after="0" w:line="264" w:lineRule="auto"/>
+            </w:pPr>
+            <w:r>
+              <w:rPr>
+                <w:rFonts w:ascii="Calibri" w:hAnsi="Calibri"/>
+                <w:color w:val="0F172A"/>
+                <w:sz w:val="19"/>
+              </w:rPr>
+              <w:t>/api/spam/check/:phoneNumber</w:t>
+            </w:r>
+          </w:p>
+        </w:tc>
+        <w:tc>
+          <w:tcPr>
+            <w:tcW w:type="dxa" w:w="1584"/>
+            <w:shd w:fill="F8FAFC"/>
+            <w:tcMar>
+              <w:top w:w="100" w:type="dxa"/>
+              <w:bottom w:w="100" w:type="dxa"/>
+              <w:left w:w="120" w:type="dxa"/>
+              <w:right w:w="120" w:type="dxa"/>
+            </w:tcMar>
+          </w:tcPr>
+          <w:p>
+            <w:pPr>
+              <w:spacing w:after="0" w:line="264" w:lineRule="auto"/>
+            </w:pPr>
+            <w:r>
+              <w:rPr>
+                <w:rFonts w:ascii="Calibri" w:hAnsi="Calibri"/>
+                <w:color w:val="0F172A"/>
+                <w:sz w:val="19"/>
+              </w:rPr>
+              <w:t>No</w:t>
+            </w:r>
+          </w:p>
+        </w:tc>
+        <w:tc>
+          <w:tcPr>
+            <w:tcW w:type="dxa" w:w="3456"/>
+            <w:shd w:fill="F8FAFC"/>
+            <w:tcMar>
+              <w:top w:w="100" w:type="dxa"/>
+              <w:bottom w:w="100" w:type="dxa"/>
+              <w:left w:w="120" w:type="dxa"/>
+              <w:right w:w="120" w:type="dxa"/>
+            </w:tcMar>
+          </w:tcPr>
+          <w:p>
+            <w:pPr>
+              <w:spacing w:after="0" w:line="264" w:lineRule="auto"/>
+            </w:pPr>
+            <w:r>
+              <w:rPr>
+                <w:rFonts w:ascii="Calibri" w:hAnsi="Calibri"/>
+                <w:color w:val="0F172A"/>
+                <w:sz w:val="19"/>
+              </w:rPr>
+              <w:t>Checks if number is flagged as community spam. Returns {isSpam, reportCount, spamScore}</w:t>
+            </w:r>
+          </w:p>
+        </w:tc>
+      </w:tr>
+      <w:tr>
+        <w:trPr>
+          <w:cantSplit/>
+        </w:trPr>
+        <w:tc>
+          <w:tcPr>
+            <w:tcW w:type="dxa" w:w="1440"/>
+            <w:shd w:fill="FFFFFF"/>
+            <w:tcMar>
+              <w:top w:w="100" w:type="dxa"/>
+              <w:bottom w:w="100" w:type="dxa"/>
+              <w:left w:w="120" w:type="dxa"/>
+              <w:right w:w="120" w:type="dxa"/>
+            </w:tcMar>
+          </w:tcPr>
+          <w:p>
+            <w:pPr>
+              <w:spacing w:after="0" w:line="264" w:lineRule="auto"/>
+            </w:pPr>
+            <w:r>
+              <w:rPr>
+                <w:rFonts w:ascii="Calibri" w:hAnsi="Calibri"/>
+                <w:color w:val="0F172A"/>
+                <w:sz w:val="19"/>
+              </w:rPr>
+              <w:t>GET</w:t>
+            </w:r>
+          </w:p>
+        </w:tc>
+        <w:tc>
+          <w:tcPr>
+            <w:tcW w:type="dxa" w:w="2880"/>
+            <w:shd w:fill="FFFFFF"/>
+            <w:tcMar>
+              <w:top w:w="100" w:type="dxa"/>
+              <w:bottom w:w="100" w:type="dxa"/>
+              <w:left w:w="120" w:type="dxa"/>
+              <w:right w:w="120" w:type="dxa"/>
+            </w:tcMar>
+          </w:tcPr>
+          <w:p>
+            <w:pPr>
+              <w:spacing w:after="0" w:line="264" w:lineRule="auto"/>
+            </w:pPr>
+            <w:r>
+              <w:rPr>
+                <w:rFonts w:ascii="Calibri" w:hAnsi="Calibri"/>
+                <w:color w:val="0F172A"/>
+                <w:sz w:val="19"/>
+              </w:rPr>
+              <w:t>/api/spam/my-spam</w:t>
+            </w:r>
+          </w:p>
+        </w:tc>
+        <w:tc>
+          <w:tcPr>
+            <w:tcW w:type="dxa" w:w="1584"/>
+            <w:shd w:fill="FFFFFF"/>
+            <w:tcMar>
+              <w:top w:w="100" w:type="dxa"/>
+              <w:bottom w:w="100" w:type="dxa"/>
+              <w:left w:w="120" w:type="dxa"/>
+              <w:right w:w="120" w:type="dxa"/>
+            </w:tcMar>
+          </w:tcPr>
+          <w:p>
+            <w:pPr>
+              <w:spacing w:after="0" w:line="264" w:lineRule="auto"/>
+            </w:pPr>
+            <w:r>
+              <w:rPr>
+                <w:rFonts w:ascii="Calibri" w:hAnsi="Calibri"/>
+                <w:color w:val="0F172A"/>
+                <w:sz w:val="19"/>
+              </w:rPr>
+              <w:t>Bearer</w:t>
+            </w:r>
+          </w:p>
+        </w:tc>
+        <w:tc>
+          <w:tcPr>
+            <w:tcW w:type="dxa" w:w="3456"/>
+            <w:shd w:fill="FFFFFF"/>
+            <w:tcMar>
+              <w:top w:w="100" w:type="dxa"/>
+              <w:bottom w:w="100" w:type="dxa"/>
+              <w:left w:w="120" w:type="dxa"/>
+              <w:right w:w="120" w:type="dxa"/>
+            </w:tcMar>
+          </w:tcPr>
+          <w:p>
+            <w:pPr>
+              <w:spacing w:after="0" w:line="264" w:lineRule="auto"/>
+            </w:pPr>
+            <w:r>
+              <w:rPr>
+                <w:rFonts w:ascii="Calibri" w:hAnsi="Calibri"/>
+                <w:color w:val="0F172A"/>
+                <w:sz w:val="19"/>
+              </w:rPr>
+              <w:t>Fetches all spam numbers flagged by current authenticated user</w:t>
+            </w:r>
+          </w:p>
+        </w:tc>
+      </w:tr>
+      <w:tr>
+        <w:trPr>
+          <w:cantSplit/>
+        </w:trPr>
+        <w:tc>
+          <w:tcPr>
+            <w:tcW w:type="dxa" w:w="1440"/>
+            <w:shd w:fill="F8FAFC"/>
+            <w:tcMar>
+              <w:top w:w="100" w:type="dxa"/>
+              <w:bottom w:w="100" w:type="dxa"/>
+              <w:left w:w="120" w:type="dxa"/>
+              <w:right w:w="120" w:type="dxa"/>
+            </w:tcMar>
+          </w:tcPr>
+          <w:p>
+            <w:pPr>
+              <w:spacing w:after="0" w:line="264" w:lineRule="auto"/>
+            </w:pPr>
+            <w:r>
+              <w:rPr>
+                <w:rFonts w:ascii="Calibri" w:hAnsi="Calibri"/>
+                <w:color w:val="0F172A"/>
+                <w:sz w:val="19"/>
+              </w:rPr>
+              <w:t>GET</w:t>
+            </w:r>
+          </w:p>
+        </w:tc>
+        <w:tc>
+          <w:tcPr>
+            <w:tcW w:type="dxa" w:w="2880"/>
+            <w:shd w:fill="F8FAFC"/>
+            <w:tcMar>
+              <w:top w:w="100" w:type="dxa"/>
+              <w:bottom w:w="100" w:type="dxa"/>
+              <w:left w:w="120" w:type="dxa"/>
+              <w:right w:w="120" w:type="dxa"/>
+            </w:tcMar>
+          </w:tcPr>
+          <w:p>
+            <w:pPr>
+              <w:spacing w:after="0" w:line="264" w:lineRule="auto"/>
+            </w:pPr>
+            <w:r>
+              <w:rPr>
+                <w:rFonts w:ascii="Calibri" w:hAnsi="Calibri"/>
+                <w:color w:val="0F172A"/>
+                <w:sz w:val="19"/>
+              </w:rPr>
+              <w:t>/api/health</w:t>
+            </w:r>
+          </w:p>
+        </w:tc>
+        <w:tc>
+          <w:tcPr>
+            <w:tcW w:type="dxa" w:w="1584"/>
+            <w:shd w:fill="F8FAFC"/>
+            <w:tcMar>
+              <w:top w:w="100" w:type="dxa"/>
+              <w:bottom w:w="100" w:type="dxa"/>
+              <w:left w:w="120" w:type="dxa"/>
+              <w:right w:w="120" w:type="dxa"/>
+            </w:tcMar>
+          </w:tcPr>
+          <w:p>
+            <w:pPr>
+              <w:spacing w:after="0" w:line="264" w:lineRule="auto"/>
+            </w:pPr>
+            <w:r>
+              <w:rPr>
+                <w:rFonts w:ascii="Calibri" w:hAnsi="Calibri"/>
+                <w:color w:val="0F172A"/>
+                <w:sz w:val="19"/>
+              </w:rPr>
+              <w:t>No</w:t>
+            </w:r>
+          </w:p>
+        </w:tc>
+        <w:tc>
+          <w:tcPr>
+            <w:tcW w:type="dxa" w:w="3456"/>
+            <w:shd w:fill="F8FAFC"/>
+            <w:tcMar>
+              <w:top w:w="100" w:type="dxa"/>
+              <w:bottom w:w="100" w:type="dxa"/>
+              <w:left w:w="120" w:type="dxa"/>
+              <w:right w:w="120" w:type="dxa"/>
+            </w:tcMar>
+          </w:tcPr>
+          <w:p>
+            <w:pPr>
+              <w:spacing w:after="0" w:line="264" w:lineRule="auto"/>
+            </w:pPr>
+            <w:r>
+              <w:rPr>
+                <w:rFonts w:ascii="Calibri" w:hAnsi="Calibri"/>
+                <w:color w:val="0F172A"/>
+                <w:sz w:val="19"/>
+              </w:rPr>
+              <w:t>System health check returning database connection status and shard host</w:t>
+            </w:r>
+          </w:p>
+        </w:tc>
+      </w:tr>
+      <w:tr>
+        <w:trPr>
+          <w:cantSplit/>
+        </w:trPr>
+        <w:tc>
+          <w:tcPr>
+            <w:tcW w:type="dxa" w:w="1440"/>
+            <w:shd w:fill="FFFFFF"/>
+            <w:tcMar>
+              <w:top w:w="100" w:type="dxa"/>
+              <w:bottom w:w="100" w:type="dxa"/>
+              <w:left w:w="120" w:type="dxa"/>
+              <w:right w:w="120" w:type="dxa"/>
+            </w:tcMar>
+          </w:tcPr>
+          <w:p>
+            <w:pPr>
+              <w:spacing w:after="0" w:line="264" w:lineRule="auto"/>
+            </w:pPr>
+            <w:r>
+              <w:rPr>
+                <w:rFonts w:ascii="Calibri" w:hAnsi="Calibri"/>
+                <w:color w:val="0F172A"/>
+                <w:sz w:val="19"/>
+              </w:rPr>
+              <w:t>POST</w:t>
+            </w:r>
+          </w:p>
+        </w:tc>
+        <w:tc>
+          <w:tcPr>
+            <w:tcW w:type="dxa" w:w="2880"/>
+            <w:shd w:fill="FFFFFF"/>
+            <w:tcMar>
+              <w:top w:w="100" w:type="dxa"/>
+              <w:bottom w:w="100" w:type="dxa"/>
+              <w:left w:w="120" w:type="dxa"/>
+              <w:right w:w="120" w:type="dxa"/>
+            </w:tcMar>
+          </w:tcPr>
+          <w:p>
+            <w:pPr>
+              <w:spacing w:after="0" w:line="264" w:lineRule="auto"/>
+            </w:pPr>
+            <w:r>
+              <w:rPr>
+                <w:rFonts w:ascii="Calibri" w:hAnsi="Calibri"/>
+                <w:color w:val="0F172A"/>
+                <w:sz w:val="19"/>
+              </w:rPr>
+              <w:t>/api/v1/ai/chat</w:t>
+            </w:r>
+          </w:p>
+        </w:tc>
+        <w:tc>
+          <w:tcPr>
+            <w:tcW w:type="dxa" w:w="1584"/>
+            <w:shd w:fill="FFFFFF"/>
+            <w:tcMar>
+              <w:top w:w="100" w:type="dxa"/>
+              <w:bottom w:w="100" w:type="dxa"/>
+              <w:left w:w="120" w:type="dxa"/>
+              <w:right w:w="120" w:type="dxa"/>
+            </w:tcMar>
+          </w:tcPr>
+          <w:p>
+            <w:pPr>
+              <w:spacing w:after="0" w:line="264" w:lineRule="auto"/>
+            </w:pPr>
+            <w:r>
+              <w:rPr>
+                <w:rFonts w:ascii="Calibri" w:hAnsi="Calibri"/>
+                <w:color w:val="0F172A"/>
+                <w:sz w:val="19"/>
+              </w:rPr>
+              <w:t>No</w:t>
+            </w:r>
+          </w:p>
+        </w:tc>
+        <w:tc>
+          <w:tcPr>
+            <w:tcW w:type="dxa" w:w="3456"/>
+            <w:shd w:fill="FFFFFF"/>
+            <w:tcMar>
+              <w:top w:w="100" w:type="dxa"/>
+              <w:bottom w:w="100" w:type="dxa"/>
+              <w:left w:w="120" w:type="dxa"/>
+              <w:right w:w="120" w:type="dxa"/>
+            </w:tcMar>
+          </w:tcPr>
+          <w:p>
+            <w:pPr>
+              <w:spacing w:after="0" w:line="264" w:lineRule="auto"/>
+            </w:pPr>
+            <w:r>
+              <w:rPr>
+                <w:rFonts w:ascii="Calibri" w:hAnsi="Calibri"/>
+                <w:color w:val="0F172A"/>
+                <w:sz w:val="19"/>
+              </w:rPr>
+              <w:t>Google Gemini 3.6 Flash live screening engine reply. Body: {call_id, conversation}</w:t>
+            </w:r>
+          </w:p>
+        </w:tc>
+      </w:tr>
+      <w:tr>
+        <w:trPr>
+          <w:cantSplit/>
+        </w:trPr>
+        <w:tc>
+          <w:tcPr>
+            <w:tcW w:type="dxa" w:w="1440"/>
+            <w:shd w:fill="F8FAFC"/>
+            <w:tcMar>
+              <w:top w:w="100" w:type="dxa"/>
+              <w:bottom w:w="100" w:type="dxa"/>
+              <w:left w:w="120" w:type="dxa"/>
+              <w:right w:w="120" w:type="dxa"/>
+            </w:tcMar>
+          </w:tcPr>
+          <w:p>
+            <w:pPr>
+              <w:spacing w:after="0" w:line="264" w:lineRule="auto"/>
+            </w:pPr>
+            <w:r>
+              <w:rPr>
+                <w:rFonts w:ascii="Calibri" w:hAnsi="Calibri"/>
+                <w:color w:val="0F172A"/>
+                <w:sz w:val="19"/>
+              </w:rPr>
+              <w:t>POST</w:t>
+            </w:r>
+          </w:p>
+        </w:tc>
+        <w:tc>
+          <w:tcPr>
+            <w:tcW w:type="dxa" w:w="2880"/>
+            <w:shd w:fill="F8FAFC"/>
+            <w:tcMar>
+              <w:top w:w="100" w:type="dxa"/>
+              <w:bottom w:w="100" w:type="dxa"/>
+              <w:left w:w="120" w:type="dxa"/>
+              <w:right w:w="120" w:type="dxa"/>
+            </w:tcMar>
+          </w:tcPr>
+          <w:p>
+            <w:pPr>
+              <w:spacing w:after="0" w:line="264" w:lineRule="auto"/>
+            </w:pPr>
+            <w:r>
+              <w:rPr>
+                <w:rFonts w:ascii="Calibri" w:hAnsi="Calibri"/>
+                <w:color w:val="0F172A"/>
+                <w:sz w:val="19"/>
+              </w:rPr>
+              <w:t>/api/v1/ai/classify</w:t>
+            </w:r>
+          </w:p>
+        </w:tc>
+        <w:tc>
+          <w:tcPr>
+            <w:tcW w:type="dxa" w:w="1584"/>
+            <w:shd w:fill="F8FAFC"/>
+            <w:tcMar>
+              <w:top w:w="100" w:type="dxa"/>
+              <w:bottom w:w="100" w:type="dxa"/>
+              <w:left w:w="120" w:type="dxa"/>
+              <w:right w:w="120" w:type="dxa"/>
+            </w:tcMar>
+          </w:tcPr>
+          <w:p>
+            <w:pPr>
+              <w:spacing w:after="0" w:line="264" w:lineRule="auto"/>
+            </w:pPr>
+            <w:r>
+              <w:rPr>
+                <w:rFonts w:ascii="Calibri" w:hAnsi="Calibri"/>
+                <w:color w:val="0F172A"/>
+                <w:sz w:val="19"/>
+              </w:rPr>
+              <w:t>No</w:t>
+            </w:r>
+          </w:p>
+        </w:tc>
+        <w:tc>
+          <w:tcPr>
+            <w:tcW w:type="dxa" w:w="3456"/>
+            <w:shd w:fill="F8FAFC"/>
+            <w:tcMar>
+              <w:top w:w="100" w:type="dxa"/>
+              <w:bottom w:w="100" w:type="dxa"/>
+              <w:left w:w="120" w:type="dxa"/>
+              <w:right w:w="120" w:type="dxa"/>
+            </w:tcMar>
+          </w:tcPr>
+          <w:p>
+            <w:pPr>
+              <w:spacing w:after="0" w:line="264" w:lineRule="auto"/>
+            </w:pPr>
+            <w:r>
+              <w:rPr>
+                <w:rFonts w:ascii="Calibri" w:hAnsi="Calibri"/>
+                <w:color w:val="0F172A"/>
+                <w:sz w:val="19"/>
+              </w:rPr>
+              <w:t>Multi-category intent classifier. Body: {call_id, conversation}</w:t>
+            </w:r>
+          </w:p>
+        </w:tc>
+      </w:tr>
+      <w:tr>
+        <w:trPr>
+          <w:cantSplit/>
+        </w:trPr>
+        <w:tc>
+          <w:tcPr>
+            <w:tcW w:type="dxa" w:w="1440"/>
+            <w:shd w:fill="FFFFFF"/>
+            <w:tcMar>
+              <w:top w:w="100" w:type="dxa"/>
+              <w:bottom w:w="100" w:type="dxa"/>
+              <w:left w:w="120" w:type="dxa"/>
+              <w:right w:w="120" w:type="dxa"/>
+            </w:tcMar>
+          </w:tcPr>
+          <w:p>
+            <w:pPr>
+              <w:spacing w:after="0" w:line="264" w:lineRule="auto"/>
+            </w:pPr>
+            <w:r>
+              <w:rPr>
+                <w:rFonts w:ascii="Calibri" w:hAnsi="Calibri"/>
+                <w:color w:val="0F172A"/>
+                <w:sz w:val="19"/>
+              </w:rPr>
+              <w:t>POST</w:t>
+            </w:r>
+          </w:p>
+        </w:tc>
+        <w:tc>
+          <w:tcPr>
+            <w:tcW w:type="dxa" w:w="2880"/>
+            <w:shd w:fill="FFFFFF"/>
+            <w:tcMar>
+              <w:top w:w="100" w:type="dxa"/>
+              <w:bottom w:w="100" w:type="dxa"/>
+              <w:left w:w="120" w:type="dxa"/>
+              <w:right w:w="120" w:type="dxa"/>
+            </w:tcMar>
+          </w:tcPr>
+          <w:p>
+            <w:pPr>
+              <w:spacing w:after="0" w:line="264" w:lineRule="auto"/>
+            </w:pPr>
+            <w:r>
+              <w:rPr>
+                <w:rFonts w:ascii="Calibri" w:hAnsi="Calibri"/>
+                <w:color w:val="0F172A"/>
+                <w:sz w:val="19"/>
+              </w:rPr>
+              <w:t>/api/v1/ai/summarize</w:t>
+            </w:r>
+          </w:p>
+        </w:tc>
+        <w:tc>
+          <w:tcPr>
+            <w:tcW w:type="dxa" w:w="1584"/>
+            <w:shd w:fill="FFFFFF"/>
+            <w:tcMar>
+              <w:top w:w="100" w:type="dxa"/>
+              <w:bottom w:w="100" w:type="dxa"/>
+              <w:left w:w="120" w:type="dxa"/>
+              <w:right w:w="120" w:type="dxa"/>
+            </w:tcMar>
+          </w:tcPr>
+          <w:p>
+            <w:pPr>
+              <w:spacing w:after="0" w:line="264" w:lineRule="auto"/>
+            </w:pPr>
+            <w:r>
+              <w:rPr>
+                <w:rFonts w:ascii="Calibri" w:hAnsi="Calibri"/>
+                <w:color w:val="0F172A"/>
+                <w:sz w:val="19"/>
+              </w:rPr>
+              <w:t>No</w:t>
+            </w:r>
+          </w:p>
+        </w:tc>
+        <w:tc>
+          <w:tcPr>
+            <w:tcW w:type="dxa" w:w="3456"/>
+            <w:shd w:fill="FFFFFF"/>
+            <w:tcMar>
+              <w:top w:w="100" w:type="dxa"/>
+              <w:bottom w:w="100" w:type="dxa"/>
+              <w:left w:w="120" w:type="dxa"/>
+              <w:right w:w="120" w:type="dxa"/>
+            </w:tcMar>
+          </w:tcPr>
+          <w:p>
+            <w:pPr>
+              <w:spacing w:after="0" w:line="264" w:lineRule="auto"/>
+            </w:pPr>
+            <w:r>
+              <w:rPr>
+                <w:rFonts w:ascii="Calibri" w:hAnsi="Calibri"/>
+                <w:color w:val="0F172A"/>
+                <w:sz w:val="19"/>
+              </w:rPr>
+              <w:t>Post-call structured summary generation. Body: {call_id, conversation, caller_name}</w:t>
+            </w:r>
+          </w:p>
+        </w:tc>
+      </w:tr>
+      <w:tr>
+        <w:trPr>
+          <w:cantSplit/>
+        </w:trPr>
+        <w:tc>
+          <w:tcPr>
+            <w:tcW w:type="dxa" w:w="1440"/>
+            <w:shd w:fill="F8FAFC"/>
+            <w:tcMar>
+              <w:top w:w="100" w:type="dxa"/>
+              <w:bottom w:w="100" w:type="dxa"/>
+              <w:left w:w="120" w:type="dxa"/>
+              <w:right w:w="120" w:type="dxa"/>
+            </w:tcMar>
+          </w:tcPr>
+          <w:p>
+            <w:pPr>
+              <w:spacing w:after="0" w:line="264" w:lineRule="auto"/>
+            </w:pPr>
+            <w:r>
+              <w:rPr>
+                <w:rFonts w:ascii="Calibri" w:hAnsi="Calibri"/>
+                <w:color w:val="0F172A"/>
+                <w:sz w:val="19"/>
+              </w:rPr>
+              <w:t>GET</w:t>
+            </w:r>
+          </w:p>
+        </w:tc>
+        <w:tc>
+          <w:tcPr>
+            <w:tcW w:type="dxa" w:w="2880"/>
+            <w:shd w:fill="F8FAFC"/>
+            <w:tcMar>
+              <w:top w:w="100" w:type="dxa"/>
+              <w:bottom w:w="100" w:type="dxa"/>
+              <w:left w:w="120" w:type="dxa"/>
+              <w:right w:w="120" w:type="dxa"/>
+            </w:tcMar>
+          </w:tcPr>
+          <w:p>
+            <w:pPr>
+              <w:spacing w:after="0" w:line="264" w:lineRule="auto"/>
+            </w:pPr>
+            <w:r>
+              <w:rPr>
+                <w:rFonts w:ascii="Calibri" w:hAnsi="Calibri"/>
+                <w:color w:val="0F172A"/>
+                <w:sz w:val="19"/>
+              </w:rPr>
+              <w:t>/api/v1/health</w:t>
+            </w:r>
+          </w:p>
+        </w:tc>
+        <w:tc>
+          <w:tcPr>
+            <w:tcW w:type="dxa" w:w="1584"/>
+            <w:shd w:fill="F8FAFC"/>
+            <w:tcMar>
+              <w:top w:w="100" w:type="dxa"/>
+              <w:bottom w:w="100" w:type="dxa"/>
+              <w:left w:w="120" w:type="dxa"/>
+              <w:right w:w="120" w:type="dxa"/>
+            </w:tcMar>
+          </w:tcPr>
+          <w:p>
+            <w:pPr>
+              <w:spacing w:after="0" w:line="264" w:lineRule="auto"/>
+            </w:pPr>
+            <w:r>
+              <w:rPr>
+                <w:rFonts w:ascii="Calibri" w:hAnsi="Calibri"/>
+                <w:color w:val="0F172A"/>
+                <w:sz w:val="19"/>
+              </w:rPr>
+              <w:t>No</w:t>
+            </w:r>
+          </w:p>
+        </w:tc>
+        <w:tc>
+          <w:tcPr>
+            <w:tcW w:type="dxa" w:w="3456"/>
+            <w:shd w:fill="F8FAFC"/>
+            <w:tcMar>
+              <w:top w:w="100" w:type="dxa"/>
+              <w:bottom w:w="100" w:type="dxa"/>
+              <w:left w:w="120" w:type="dxa"/>
+              <w:right w:w="120" w:type="dxa"/>
+            </w:tcMar>
+          </w:tcPr>
+          <w:p>
+            <w:pPr>
+              <w:spacing w:after="0" w:line="264" w:lineRule="auto"/>
+            </w:pPr>
+            <w:r>
+              <w:rPr>
+                <w:rFonts w:ascii="Calibri" w:hAnsi="Calibri"/>
+                <w:color w:val="0F172A"/>
+                <w:sz w:val="19"/>
+              </w:rPr>
+              <w:t>FastAPI health check reporting Gemini AI engine status</w:t>
             </w:r>
           </w:p>
         </w:tc>
@@ -10026,7 +10952,7 @@
         <w:rPr>
           <w:color w:val="0F172A"/>
         </w:rPr>
-        <w:t xml:space="preserve"> Cloud Auth: http://10.0.2.2:5000/api/ | AI Screening Engine: http://10.0.2.2:8000/api/v1/</w:t>
+        <w:t xml:space="preserve"> Cloud Auth &amp; MongoDB: http://10.0.2.2:5000/api/ | AI Screening Engine: http://10.0.2.2:8000/api/v1/</w:t>
       </w:r>
     </w:p>
     <w:p>
@@ -10092,7 +11018,7 @@
           <w:color w:val="0F172A"/>
           <w:sz w:val="21"/>
         </w:rPr>
-        <w:t>The 'You' section is CallMate AI's settings and user management dashboard. All 9 subsections are fully implemented:</w:t>
+        <w:t>The 'You' section is CallMate AI's settings and user management dashboard. All subsections are fully implemented:</w:t>
       </w:r>
     </w:p>
     <w:p>
@@ -10149,7 +11075,7 @@
         <w:rPr>
           <w:color w:val="0F172A"/>
         </w:rPr>
-        <w:t xml:space="preserve"> Full editable prompt screen where users configure screening rules for courier drivers, job recruiters, and promotional loans.</w:t>
+        <w:t xml:space="preserve"> Interactive manager where users add (+ Add New Screening Instruction), edit, and delete custom rules with cloud sync to MongoDB.</w:t>
       </w:r>
     </w:p>
     <w:p>
@@ -10168,7 +11094,7 @@
         <w:rPr>
           <w:color w:val="0F172A"/>
         </w:rPr>
-        <w:t xml:space="preserve"> Interactive connectivity screen that tests latency against http://10.0.2.2:8000 and reports backend health.</w:t>
+        <w:t xml:space="preserve"> Interactive connectivity screen testing latency against http://10.0.2.2:8000 and reporting backend health.</w:t>
       </w:r>
     </w:p>
     <w:p>
@@ -10206,7 +11132,7 @@
         <w:rPr>
           <w:color w:val="0F172A"/>
         </w:rPr>
-        <w:t xml:space="preserve"> Voice customization screen with pitch (0.5x - 2.0x) and speed sliders, language picker, and TTS sample player.</w:t>
+        <w:t xml:space="preserve"> Voice customization screen with pitch and speed sliders, language picker, and TTS sample preview.</w:t>
       </w:r>
     </w:p>
     <w:p>
@@ -10219,13 +11145,13 @@
           <w:b/>
           <w:color w:val="0F172A"/>
         </w:rPr>
-        <w:t>7. Your Addresses:</w:t>
+        <w:t>7. Your Addresses &amp; Live GPS:</w:t>
       </w:r>
       <w:r>
         <w:rPr>
           <w:color w:val="0F172A"/>
         </w:rPr>
-        <w:t xml:space="preserve"> Complete CRUD address manager supporting Home, Office, College, and Other labels with delivery driver notes.</w:t>
+        <w:t xml:space="preserve"> Displays real-time reverse-geocoded street address (OpenStreetMap Nominatim) and supports custom courier drop-off locations.</w:t>
       </w:r>
     </w:p>
     <w:p>
@@ -10238,13 +11164,13 @@
           <w:b/>
           <w:color w:val="0F172A"/>
         </w:rPr>
-        <w:t>8. WhatsApp Updates:</w:t>
+        <w:t>8. Invite a Friend:</w:t>
       </w:r>
       <w:r>
         <w:rPr>
           <w:color w:val="0F172A"/>
         </w:rPr>
-        <w:t xml:space="preserve"> Notification preference toggles for instant recap alerts, urgent call alerts, and feature announcements.</w:t>
+        <w:t xml:space="preserve"> Instantly copies official GitHub repository link (https://github.com/sanjana71006/CallAgent) and opens Android share sheet.</w:t>
       </w:r>
     </w:p>
     <w:p>
@@ -10263,7 +11189,7 @@
         <w:rPr>
           <w:color w:val="0F172A"/>
         </w:rPr>
-        <w:t xml:space="preserve"> Shows cloud account status (ACTIVE), MongoDB storage indicator, prominent Sign Out button, and Delete Account trigger.</w:t>
+        <w:t xml:space="preserve"> Shows cloud account status (ACTIVE), MongoDB storage indicator, Sign Out confirmation, and Delete Account trigger.</w:t>
       </w:r>
     </w:p>
     <w:p>
@@ -10291,7 +11217,7 @@
           <w:color w:val="0F172A"/>
           <w:sz w:val="21"/>
         </w:rPr>
-        <w:t>CallMate AI currently implements spam detection using a hybrid rule-based and simulated classification pipeline. When a call arrives, the system normalizes the telephone number, checks user-defined Silent Mode filtering rules, and triggers AI classification.</w:t>
+        <w:t>CallMate AI implements a multi-tier defense architecture combining local contact whitelisting, crowdsourced community threat databases (MongoDB Atlas), and Gemini LLM intent classification.</w:t>
       </w:r>
     </w:p>
     <w:tbl>
@@ -10332,37 +11258,32 @@
               <w:br/>
               <w:t xml:space="preserve">        v</w:t>
               <w:br/>
-              <w:t>[Phone Normalization] -&gt; Strips non-digits, normalizes country codes</w:t>
+              <w:t>[Phone Contacts Lookup (ContactsContract)]</w:t>
+              <w:br/>
+              <w:t xml:space="preserve">  - Is caller saved in Address Book? -&gt; Direct Ring (Bypass Screening)</w:t>
+              <w:br/>
+              <w:t xml:space="preserve">        |</w:t>
+              <w:br/>
+              <w:t xml:space="preserve">        v [Unknown Number]</w:t>
+              <w:br/>
+              <w:t>[Global Spam Threat Check (GET /api/spam/check/:phoneNumber)]</w:t>
+              <w:br/>
+              <w:t xml:space="preserve">  - Is caller reported in MongoDB? -&gt; Threat Badge (🚨 Likely Spam)</w:t>
               <w:br/>
               <w:t xml:space="preserve">        |</w:t>
               <w:br/>
               <w:t xml:space="preserve">        v</w:t>
               <w:br/>
-              <w:t>[Silent Mode Heuristic Check (Room)]</w:t>
+              <w:t>[AI Intent Classifier (/api/v1/ai/classify - Gemini 3.6 Flash)]</w:t>
               <w:br/>
-              <w:t xml:space="preserve">  - Is caller flagged as Telemarketer? -&gt; Silence</w:t>
-              <w:br/>
-              <w:t xml:space="preserve">  - Is caller flagged as Potential Scam? -&gt; Silence</w:t>
-              <w:br/>
-              <w:t xml:space="preserve">  - Is caller flagged as Unknown Spam? -&gt; Auto-Screen with AI</w:t>
+              <w:t xml:space="preserve">  - Evaluates conversation for loan scams, telemarketing, robocalls</w:t>
               <w:br/>
               <w:t xml:space="preserve">        |</w:t>
               <w:br/>
               <w:t xml:space="preserve">        v</w:t>
               <w:br/>
-              <w:t>[AI Intent Classifier (/api/v1/ai/classify)]</w:t>
+              <w:t>[Post-Call User Spam Reporting (POST /api/spam/report)]</w:t>
               <w:br/>
-              <w:t xml:space="preserve">  - Evaluates initial greeting &amp; caller response</w:t>
-              <w:br/>
-              <w:t xml:space="preserve">  - Returns Category (SPAM, DELIVERY, RECRUITER, BANK, UNKNOWN)</w:t>
-              <w:br/>
-              <w:t xml:space="preserve">  - Computes Confidence Score (0.00 - 1.00)</w:t>
-              <w:br/>
-              <w:t xml:space="preserve">        |</w:t>
-              <w:br/>
-              <w:t xml:space="preserve">        v</w:t>
-              <w:br/>
-              <w:t>[Action Decision: Allow / Mute / Screen / Decline]</w:t>
             </w:r>
           </w:p>
         </w:tc>
@@ -10692,7 +11613,7 @@
           <w:color w:val="0F172A"/>
           <w:sz w:val="21"/>
         </w:rPr>
-        <w:t>The AI engine operates via a Python FastAPI service located in backend/app/ with a dual-provider architecture:</w:t>
+        <w:t>The AI screening engine operates via a Python FastAPI service located in backend/app/ with a multi-provider architecture:</w:t>
       </w:r>
     </w:p>
     <w:p>
@@ -10705,13 +11626,32 @@
           <w:b/>
           <w:color w:val="0F172A"/>
         </w:rPr>
-        <w:t>Ollama Local LLM Provider:</w:t>
+        <w:t>Google Gemini Cloud Provider (Default / Production):</w:t>
       </w:r>
       <w:r>
         <w:rPr>
           <w:color w:val="0F172A"/>
         </w:rPr>
-        <w:t xml:space="preserve"> Connects to a locally running Ollama daemon (http://localhost:11434) using the lightweight qwen2.5:0.5b model for low-latency inference.</w:t>
+        <w:t xml:space="preserve"> Directly connects to Google's Gemini 3.6 Flash model (gemini-3.6-flash) via official Generative AI REST endpoints for sub-second conversational screening, high-precision intent classification, and structured post-call summaries.</w:t>
+      </w:r>
+    </w:p>
+    <w:p>
+      <w:pPr>
+        <w:pStyle w:val="ListBullet"/>
+        <w:spacing w:after="80" w:line="276" w:lineRule="auto"/>
+      </w:pPr>
+      <w:r>
+        <w:rPr>
+          <w:b/>
+          <w:color w:val="0F172A"/>
+        </w:rPr>
+        <w:t>Ollama Local LLM Provider (Offline Edge):</w:t>
+      </w:r>
+      <w:r>
+        <w:rPr>
+          <w:color w:val="0F172A"/>
+        </w:rPr>
+        <w:t xml:space="preserve"> Connects to a locally running Ollama daemon (http://localhost:11434) using the lightweight qwen2.5:0.5b model for complete on-device privacy.</w:t>
       </w:r>
     </w:p>
     <w:p>
@@ -10730,7 +11670,7 @@
         <w:rPr>
           <w:color w:val="0F172A"/>
         </w:rPr>
-        <w:t xml:space="preserve"> If Ollama is offline or degraded, the system automatically falls back to MockAIProvider to generate realistic conversational screening turns.</w:t>
+        <w:t xml:space="preserve"> If cloud and local LLM services are unreachable, the system automatically falls back to MockAIProvider to generate realistic conversational screening turns.</w:t>
       </w:r>
     </w:p>
     <w:p>
@@ -10768,7 +11708,7 @@
         <w:rPr>
           <w:color w:val="0F172A"/>
         </w:rPr>
-        <w:t xml:space="preserve"> Integrated via Android's SpeechRecognizer in SpeechToTextManager.kt.</w:t>
+        <w:t xml:space="preserve"> Integrated via Android's SpeechRecognizer in SpeechToTextManager.kt and Web Speech API in web simulator.</w:t>
       </w:r>
     </w:p>
     <w:p>
@@ -10978,7 +11918,7 @@
                 <w:color w:val="0F172A"/>
                 <w:sz w:val="19"/>
               </w:rPr>
-              <w:t>Persisted in local Room SQLite database</w:t>
+              <w:t>Persisted in local Room SQLite database (callmate_ai.db)</w:t>
             </w:r>
           </w:p>
         </w:tc>
@@ -11089,7 +12029,7 @@
                 <w:color w:val="0F172A"/>
                 <w:sz w:val="19"/>
               </w:rPr>
-              <w:t>Addresses Management</w:t>
+              <w:t>Contacts Whitelist</w:t>
             </w:r>
           </w:p>
         </w:tc>
@@ -11140,7 +12080,7 @@
                 <w:color w:val="0F172A"/>
                 <w:sz w:val="19"/>
               </w:rPr>
-              <w:t>Full CRUD operations operate 100% locally in Room</w:t>
+              <w:t>Queries device ContactsContract on-device</w:t>
             </w:r>
           </w:p>
         </w:tc>
@@ -11170,7 +12110,7 @@
                 <w:color w:val="0F172A"/>
                 <w:sz w:val="19"/>
               </w:rPr>
-              <w:t>Assistant Instructions</w:t>
+              <w:t>Addresses Management</w:t>
             </w:r>
           </w:p>
         </w:tc>
@@ -11221,7 +12161,7 @@
                 <w:color w:val="0F172A"/>
                 <w:sz w:val="19"/>
               </w:rPr>
-              <w:t>Screening rules stored locally in assistant_instructions</w:t>
+              <w:t>Full CRUD operations operate locally and sync when online</w:t>
             </w:r>
           </w:p>
         </w:tc>
@@ -11251,7 +12191,7 @@
                 <w:color w:val="0F172A"/>
                 <w:sz w:val="19"/>
               </w:rPr>
-              <w:t>Voice Pitch &amp; Speed Settings</w:t>
+              <w:t>Assistant Instructions</w:t>
             </w:r>
           </w:p>
         </w:tc>
@@ -11302,7 +12242,7 @@
                 <w:color w:val="0F172A"/>
                 <w:sz w:val="19"/>
               </w:rPr>
-              <w:t>Stored in Room and applied via on-device Android TTS</w:t>
+              <w:t>Screening rules stored locally and synced to MongoDB</w:t>
             </w:r>
           </w:p>
         </w:tc>
@@ -11332,7 +12272,7 @@
                 <w:color w:val="0F172A"/>
                 <w:sz w:val="19"/>
               </w:rPr>
-              <w:t>Silent Mode Switches</w:t>
+              <w:t>Voice Pitch &amp; Speed Settings</w:t>
             </w:r>
           </w:p>
         </w:tc>
@@ -11383,7 +12323,7 @@
                 <w:color w:val="0F172A"/>
                 <w:sz w:val="19"/>
               </w:rPr>
-              <w:t>Heuristic rules evaluated on-device without cloud</w:t>
+              <w:t>Stored in Room and applied via on-device Android TTS</w:t>
             </w:r>
           </w:p>
         </w:tc>
@@ -11413,7 +12353,7 @@
                 <w:color w:val="0F172A"/>
                 <w:sz w:val="19"/>
               </w:rPr>
-              <w:t>User Registration</w:t>
+              <w:t>Silent Mode Switches</w:t>
             </w:r>
           </w:p>
         </w:tc>
@@ -11436,10 +12376,10 @@
               <w:rPr>
                 <w:rFonts w:ascii="Calibri" w:hAnsi="Calibri"/>
                 <w:b/>
-                <w:color w:val="DC2626"/>
-                <w:sz w:val="19"/>
-              </w:rPr>
-              <w:t>NO</w:t>
+                <w:color w:val="059669"/>
+                <w:sz w:val="19"/>
+              </w:rPr>
+              <w:t>YES</w:t>
             </w:r>
           </w:p>
         </w:tc>
@@ -11464,7 +12404,7 @@
                 <w:color w:val="0F172A"/>
                 <w:sz w:val="19"/>
               </w:rPr>
-              <w:t>Requires connection to Node.js backend &amp; MongoDB Atlas</w:t>
+              <w:t>Heuristic rules evaluated on-device without cloud</w:t>
             </w:r>
           </w:p>
         </w:tc>
@@ -11494,7 +12434,7 @@
                 <w:color w:val="0F172A"/>
                 <w:sz w:val="19"/>
               </w:rPr>
-              <w:t>User Login</w:t>
+              <w:t>User Registration</w:t>
             </w:r>
           </w:p>
         </w:tc>
@@ -11545,7 +12485,7 @@
                 <w:color w:val="0F172A"/>
                 <w:sz w:val="19"/>
               </w:rPr>
-              <w:t>Requires password verification against MongoDB Atlas</w:t>
+              <w:t>Requires connection to Node.js backend &amp; MongoDB Atlas</w:t>
             </w:r>
           </w:p>
         </w:tc>
@@ -11575,7 +12515,7 @@
                 <w:color w:val="0F172A"/>
                 <w:sz w:val="19"/>
               </w:rPr>
-              <w:t>Cloud Account Deletion</w:t>
+              <w:t>User Login</w:t>
             </w:r>
           </w:p>
         </w:tc>
@@ -11626,7 +12566,7 @@
                 <w:color w:val="0F172A"/>
                 <w:sz w:val="19"/>
               </w:rPr>
-              <w:t>Requires DELETE /api/users/me on cloud backend</w:t>
+              <w:t>Requires password verification against MongoDB Atlas</w:t>
             </w:r>
           </w:p>
         </w:tc>
@@ -11656,7 +12596,7 @@
                 <w:color w:val="0F172A"/>
                 <w:sz w:val="19"/>
               </w:rPr>
-              <w:t>AI Screening (Ollama Local)</w:t>
+              <w:t>Global Spam Registry</w:t>
             </w:r>
           </w:p>
         </w:tc>
@@ -11679,10 +12619,10 @@
               <w:rPr>
                 <w:rFonts w:ascii="Calibri" w:hAnsi="Calibri"/>
                 <w:b/>
-                <w:color w:val="059669"/>
-                <w:sz w:val="19"/>
-              </w:rPr>
-              <w:t>YES</w:t>
+                <w:color w:val="DC2626"/>
+                <w:sz w:val="19"/>
+              </w:rPr>
+              <w:t>NO</w:t>
             </w:r>
           </w:p>
         </w:tc>
@@ -11707,7 +12647,7 @@
                 <w:color w:val="0F172A"/>
                 <w:sz w:val="19"/>
               </w:rPr>
-              <w:t>Operates offline if Ollama server is hosted on device/LAN</w:t>
+              <w:t>Queries crowdsourced spam tally in MongoDB Atlas</w:t>
             </w:r>
           </w:p>
         </w:tc>
@@ -11737,7 +12677,7 @@
                 <w:color w:val="0F172A"/>
                 <w:sz w:val="19"/>
               </w:rPr>
-              <w:t>AI Screening (Cloud LLM)</w:t>
+              <w:t>AI Screening (Gemini Cloud)</w:t>
             </w:r>
           </w:p>
         </w:tc>
@@ -11788,7 +12728,88 @@
                 <w:color w:val="0F172A"/>
                 <w:sz w:val="19"/>
               </w:rPr>
-              <w:t>Requires network connection if cloud AI API is configured</w:t>
+              <w:t>Requires network connection to Google Gemini API</w:t>
+            </w:r>
+          </w:p>
+        </w:tc>
+      </w:tr>
+      <w:tr>
+        <w:trPr>
+          <w:cantSplit/>
+        </w:trPr>
+        <w:tc>
+          <w:tcPr>
+            <w:tcW w:type="dxa" w:w="3168"/>
+            <w:shd w:fill="F8FAFC"/>
+            <w:tcMar>
+              <w:top w:w="100" w:type="dxa"/>
+              <w:bottom w:w="100" w:type="dxa"/>
+              <w:left w:w="120" w:type="dxa"/>
+              <w:right w:w="120" w:type="dxa"/>
+            </w:tcMar>
+          </w:tcPr>
+          <w:p>
+            <w:pPr>
+              <w:spacing w:after="0" w:line="264" w:lineRule="auto"/>
+            </w:pPr>
+            <w:r>
+              <w:rPr>
+                <w:rFonts w:ascii="Calibri" w:hAnsi="Calibri"/>
+                <w:color w:val="0F172A"/>
+                <w:sz w:val="19"/>
+              </w:rPr>
+              <w:t>AI Screening (Ollama Local)</w:t>
+            </w:r>
+          </w:p>
+        </w:tc>
+        <w:tc>
+          <w:tcPr>
+            <w:tcW w:type="dxa" w:w="2016"/>
+            <w:shd w:fill="F8FAFC"/>
+            <w:tcMar>
+              <w:top w:w="100" w:type="dxa"/>
+              <w:bottom w:w="100" w:type="dxa"/>
+              <w:left w:w="120" w:type="dxa"/>
+              <w:right w:w="120" w:type="dxa"/>
+            </w:tcMar>
+          </w:tcPr>
+          <w:p>
+            <w:pPr>
+              <w:spacing w:after="0" w:line="264" w:lineRule="auto"/>
+            </w:pPr>
+            <w:r>
+              <w:rPr>
+                <w:rFonts w:ascii="Calibri" w:hAnsi="Calibri"/>
+                <w:b/>
+                <w:color w:val="059669"/>
+                <w:sz w:val="19"/>
+              </w:rPr>
+              <w:t>YES</w:t>
+            </w:r>
+          </w:p>
+        </w:tc>
+        <w:tc>
+          <w:tcPr>
+            <w:tcW w:type="dxa" w:w="4176"/>
+            <w:shd w:fill="F8FAFC"/>
+            <w:tcMar>
+              <w:top w:w="100" w:type="dxa"/>
+              <w:bottom w:w="100" w:type="dxa"/>
+              <w:left w:w="120" w:type="dxa"/>
+              <w:right w:w="120" w:type="dxa"/>
+            </w:tcMar>
+          </w:tcPr>
+          <w:p>
+            <w:pPr>
+              <w:spacing w:after="0" w:line="264" w:lineRule="auto"/>
+            </w:pPr>
+            <w:r>
+              <w:rPr>
+                <w:rFonts w:ascii="Calibri" w:hAnsi="Calibri"/>
+                <w:color w:val="0F172A"/>
+                <w:sz w:val="19"/>
+              </w:rPr>
+              <w:t>Operates offline if Ollama server is hosted on device/LAN</w:t>
             </w:r>
           </w:p>
         </w:tc>
@@ -11954,15 +12975,17 @@
               </w:rPr>
               <w:t xml:space="preserve">Incoming Call Triggered </w:t>
               <w:br/>
-              <w:t xml:space="preserve">       ---&gt; [SimulatorCallProvider.startIncomingCall()]</w:t>
+              <w:t xml:space="preserve">       ---&gt; [ContactsManager: Check ContactsContract]</w:t>
               <w:br/>
-              <w:t xml:space="preserve">       ---&gt; [IncomingCallScreen.kt: 'Let AI Screen']</w:t>
+              <w:t xml:space="preserve">       ---&gt; If in Contacts -&gt; Direct Ring</w:t>
               <w:br/>
-              <w:t xml:space="preserve">       ---&gt; [LiveCallScreen.kt Audio Loop]</w:t>
+              <w:t xml:space="preserve">       ---&gt; If Unknown -&gt; [IncomingCallScreen: 'Let AI Screen']</w:t>
+              <w:br/>
+              <w:t xml:space="preserve">       ---&gt; [LiveCallScreen Audio Loop]</w:t>
               <w:br/>
               <w:t xml:space="preserve">       ---&gt; [Retrofit POST /api/v1/ai/chat]</w:t>
               <w:br/>
-              <w:t xml:space="preserve">       ---&gt; [FastAPI ai_service.py -&gt; Ollama/Mock]</w:t>
+              <w:t xml:space="preserve">       ---&gt; [FastAPI ai_service.py -&gt; Google Gemini 3.6 Flash]</w:t>
               <w:br/>
               <w:t xml:space="preserve">       ---&gt; [TextToSpeechManager.speakText()]</w:t>
               <w:br/>
@@ -12043,6 +13066,8 @@
               </w:rPr>
               <w:t>CallMate AI/</w:t>
               <w:br/>
+              <w:t>├── CallMate_AI_v1.0.0_debug.apk         # Downloadable Android standalone APK</w:t>
+              <w:br/>
               <w:t>├── android/                             # Android Client Project</w:t>
               <w:br/>
               <w:t>│   ├── app/</w:t>
@@ -12055,11 +13080,11 @@
               <w:br/>
               <w:t>│   │       ├── java/com/callmate/ai/</w:t>
               <w:br/>
-              <w:t>│   │       │   ├── CallMateApp.kt       # Application class (DB initialization)</w:t>
+              <w:t>│   │       │   ├── CallMateApp.kt       # Application class (DB &amp; Contacts init)</w:t>
               <w:br/>
               <w:t>│   │       │   ├── MainActivity.kt      # Main entry point activity</w:t>
               <w:br/>
-              <w:t>│   │       │   ├── core/                # Audio, telephony, and Compose themes</w:t>
+              <w:t>│   │       │   ├── core/                # Audio, Contacts, telephony, Compose themes</w:t>
               <w:br/>
               <w:t>│   │       │   ├── data/</w:t>
               <w:br/>
@@ -12081,21 +13106,17 @@
               <w:br/>
               <w:t>│   │   ├── config/                      # MongoDB Atlas connection (database.js)</w:t>
               <w:br/>
-              <w:t>│   │   ├── controllers/                 # authController.js, userController.js</w:t>
+              <w:t>│   │   ├── controllers/                 # authController.js, userController.js, spamController.js</w:t>
               <w:br/>
               <w:t>│   │   ├── middleware/                  # authMiddleware.js (JWT validation)</w:t>
               <w:br/>
-              <w:t>│   │   ├── models/                      # User.js (Mongoose User Schema)</w:t>
+              <w:t>│   │   ├── models/                      # User.js, SpamNumber.js</w:t>
               <w:br/>
-              <w:t>│   │   ├── routes/                      # authRoutes.js, userRoutes.js</w:t>
+              <w:t>│   │   ├── routes/                      # authRoutes.js, userRoutes.js, spamRoutes.js</w:t>
               <w:br/>
               <w:t>│   │   ├── services/                    # authService.js, userStore.js</w:t>
               <w:br/>
-              <w:t>│   │   ├── tests/                       # test_server.js (17 integration tests)</w:t>
-              <w:br/>
-              <w:t>│   │   ├── package.json                 # Node dependencies and test scripts</w:t>
-              <w:br/>
-              <w:t>│   │   └── .env                         # Server configuration &amp; MongoDB URI</w:t>
+              <w:t>│   │   └── package.json                 # Node dependencies and test scripts</w:t>
               <w:br/>
               <w:t>│   └── app/                             # Python FastAPI AI Screening Backend</w:t>
               <w:br/>
@@ -12103,7 +13124,7 @@
               <w:br/>
               <w:t>│       ├── core/                        # Settings &amp; logging configuration</w:t>
               <w:br/>
-              <w:t>│       ├── services/                    # Ollama &amp; Mock AI providers</w:t>
+              <w:t>│       ├── services/                    # Gemini, Ollama &amp; Mock AI providers</w:t>
               <w:br/>
               <w:t>│       ├── static/                      # Web simulator (index.html)</w:t>
               <w:br/>
@@ -12356,7 +13377,7 @@
                 <w:color w:val="0F172A"/>
                 <w:sz w:val="19"/>
               </w:rPr>
-              <w:t>NavGraph.kt</w:t>
+              <w:t>ContactsManager.kt</w:t>
             </w:r>
           </w:p>
         </w:tc>
@@ -12381,7 +13402,7 @@
                 <w:color w:val="0F172A"/>
                 <w:sz w:val="19"/>
               </w:rPr>
-              <w:t>Android Navigation</w:t>
+              <w:t>Android Contacts</w:t>
             </w:r>
           </w:p>
         </w:tc>
@@ -12406,7 +13427,7 @@
                 <w:color w:val="0F172A"/>
                 <w:sz w:val="19"/>
               </w:rPr>
-              <w:t>Compose Navigation router handling Auth and Main tab graphs</w:t>
+              <w:t>Queries ContactsContract to whitelist known phone numbers</w:t>
             </w:r>
           </w:p>
         </w:tc>
@@ -12436,7 +13457,7 @@
                 <w:color w:val="0F172A"/>
                 <w:sz w:val="19"/>
               </w:rPr>
-              <w:t>AuthViewModel.kt</w:t>
+              <w:t>NavGraph.kt</w:t>
             </w:r>
           </w:p>
         </w:tc>
@@ -12461,7 +13482,7 @@
                 <w:color w:val="0F172A"/>
                 <w:sz w:val="19"/>
               </w:rPr>
-              <w:t>Android Auth</w:t>
+              <w:t>Android Navigation</w:t>
             </w:r>
           </w:p>
         </w:tc>
@@ -12486,7 +13507,7 @@
                 <w:color w:val="0F172A"/>
                 <w:sz w:val="19"/>
               </w:rPr>
-              <w:t>Manages AuthState (Loading, Authenticated, Unauthenticated)</w:t>
+              <w:t>Compose Navigation router handling Auth and Main tab graphs</w:t>
             </w:r>
           </w:p>
         </w:tc>
@@ -12516,7 +13537,7 @@
                 <w:color w:val="0F172A"/>
                 <w:sz w:val="19"/>
               </w:rPr>
-              <w:t>SettingsViewModel.kt</w:t>
+              <w:t>AuthViewModel.kt</w:t>
             </w:r>
           </w:p>
         </w:tc>
@@ -12541,7 +13562,7 @@
                 <w:color w:val="0F172A"/>
                 <w:sz w:val="19"/>
               </w:rPr>
-              <w:t>Android Settings</w:t>
+              <w:t>Android Auth</w:t>
             </w:r>
           </w:p>
         </w:tc>
@@ -12566,7 +13587,7 @@
                 <w:color w:val="0F172A"/>
                 <w:sz w:val="19"/>
               </w:rPr>
-              <w:t>Binds Room local settings flows to Compose UI</w:t>
+              <w:t>Manages AuthState (Loading, Authenticated, Unauthenticated)</w:t>
             </w:r>
           </w:p>
         </w:tc>
@@ -12596,7 +13617,7 @@
                 <w:color w:val="0F172A"/>
                 <w:sz w:val="19"/>
               </w:rPr>
-              <w:t>SimulatorCallProvider.kt</w:t>
+              <w:t>SettingsViewModel.kt</w:t>
             </w:r>
           </w:p>
         </w:tc>
@@ -12621,7 +13642,7 @@
                 <w:color w:val="0F172A"/>
                 <w:sz w:val="19"/>
               </w:rPr>
-              <w:t>Android Telephony</w:t>
+              <w:t>Android Settings</w:t>
             </w:r>
           </w:p>
         </w:tc>
@@ -12646,7 +13667,7 @@
                 <w:color w:val="0F172A"/>
                 <w:sz w:val="19"/>
               </w:rPr>
-              <w:t>Simulates incoming calls, state transitions, and audio screening</w:t>
+              <w:t>Binds Room local settings flows to Compose UI</w:t>
             </w:r>
           </w:p>
         </w:tc>
@@ -12676,7 +13697,7 @@
                 <w:color w:val="0F172A"/>
                 <w:sz w:val="19"/>
               </w:rPr>
-              <w:t>server.js</w:t>
+              <w:t>SimulatorCallProvider.kt</w:t>
             </w:r>
           </w:p>
         </w:tc>
@@ -12701,7 +13722,7 @@
                 <w:color w:val="0F172A"/>
                 <w:sz w:val="19"/>
               </w:rPr>
-              <w:t>Node.js Backend</w:t>
+              <w:t>Android Telephony</w:t>
             </w:r>
           </w:p>
         </w:tc>
@@ -12726,7 +13747,7 @@
                 <w:color w:val="0F172A"/>
                 <w:sz w:val="19"/>
               </w:rPr>
-              <w:t>Express server setup, CORS configuration, route mounting</w:t>
+              <w:t>Simulates incoming calls, state transitions, and audio screening</w:t>
             </w:r>
           </w:p>
         </w:tc>
@@ -12756,7 +13777,7 @@
                 <w:color w:val="0F172A"/>
                 <w:sz w:val="19"/>
               </w:rPr>
-              <w:t>database.js</w:t>
+              <w:t>server.js</w:t>
             </w:r>
           </w:p>
         </w:tc>
@@ -12781,7 +13802,7 @@
                 <w:color w:val="0F172A"/>
                 <w:sz w:val="19"/>
               </w:rPr>
-              <w:t>Node.js Config</w:t>
+              <w:t>Node.js Backend</w:t>
             </w:r>
           </w:p>
         </w:tc>
@@ -12806,7 +13827,7 @@
                 <w:color w:val="0F172A"/>
                 <w:sz w:val="19"/>
               </w:rPr>
-              <w:t>Mongoose connection to MongoDB Atlas with offline resilience</w:t>
+              <w:t>Express server setup, CORS configuration, route mounting</w:t>
             </w:r>
           </w:p>
         </w:tc>
@@ -12836,7 +13857,7 @@
                 <w:color w:val="0F172A"/>
                 <w:sz w:val="19"/>
               </w:rPr>
-              <w:t>authController.js</w:t>
+              <w:t>database.js</w:t>
             </w:r>
           </w:p>
         </w:tc>
@@ -12861,7 +13882,7 @@
                 <w:color w:val="0F172A"/>
                 <w:sz w:val="19"/>
               </w:rPr>
-              <w:t>Node.js Controller</w:t>
+              <w:t>Node.js Config</w:t>
             </w:r>
           </w:p>
         </w:tc>
@@ -12886,7 +13907,7 @@
                 <w:color w:val="0F172A"/>
                 <w:sz w:val="19"/>
               </w:rPr>
-              <w:t>register(), login(), logout(), getMe() implementations</w:t>
+              <w:t>Mongoose connection to MongoDB Atlas with offline resilience</w:t>
             </w:r>
           </w:p>
         </w:tc>
@@ -12916,7 +13937,7 @@
                 <w:color w:val="0F172A"/>
                 <w:sz w:val="19"/>
               </w:rPr>
-              <w:t>userStore.js</w:t>
+              <w:t>userController.js</w:t>
             </w:r>
           </w:p>
         </w:tc>
@@ -12941,7 +13962,7 @@
                 <w:color w:val="0F172A"/>
                 <w:sz w:val="19"/>
               </w:rPr>
-              <w:t>Node.js Service</w:t>
+              <w:t>Node.js Controller</w:t>
             </w:r>
           </w:p>
         </w:tc>
@@ -12966,7 +13987,7 @@
                 <w:color w:val="0F172A"/>
                 <w:sz w:val="19"/>
               </w:rPr>
-              <w:t>Unified persistence layer mediating between Atlas and local cache</w:t>
+              <w:t>Handles GPS location updates, addresses, and screening rules</w:t>
             </w:r>
           </w:p>
         </w:tc>
@@ -12996,7 +14017,7 @@
                 <w:color w:val="0F172A"/>
                 <w:sz w:val="19"/>
               </w:rPr>
-              <w:t>User.js</w:t>
+              <w:t>spamController.js</w:t>
             </w:r>
           </w:p>
         </w:tc>
@@ -13021,7 +14042,7 @@
                 <w:color w:val="0F172A"/>
                 <w:sz w:val="19"/>
               </w:rPr>
-              <w:t>Node.js Model</w:t>
+              <w:t>Node.js Controller</w:t>
             </w:r>
           </w:p>
         </w:tc>
@@ -13046,7 +14067,7 @@
                 <w:color w:val="0F172A"/>
                 <w:sz w:val="19"/>
               </w:rPr>
-              <w:t>Mongoose schema with bcrypt password hashing pre-save hooks</w:t>
+              <w:t>Manages crowdsourced spam number reporting and lookup queries</w:t>
             </w:r>
           </w:p>
         </w:tc>
@@ -13076,7 +14097,7 @@
                 <w:color w:val="0F172A"/>
                 <w:sz w:val="19"/>
               </w:rPr>
-              <w:t>ai_service.py</w:t>
+              <w:t>SpamNumber.js</w:t>
             </w:r>
           </w:p>
         </w:tc>
@@ -13101,7 +14122,7 @@
                 <w:color w:val="0F172A"/>
                 <w:sz w:val="19"/>
               </w:rPr>
-              <w:t>FastAPI Service</w:t>
+              <w:t>Node.js Model</w:t>
             </w:r>
           </w:p>
         </w:tc>
@@ -13126,7 +14147,7 @@
                 <w:color w:val="0F172A"/>
                 <w:sz w:val="19"/>
               </w:rPr>
-              <w:t>Coordinates prompt execution against Ollama and Mock providers</w:t>
+              <w:t>Mongoose schema for global spam threat registry</w:t>
             </w:r>
           </w:p>
         </w:tc>
@@ -13156,7 +14177,7 @@
                 <w:color w:val="0F172A"/>
                 <w:sz w:val="19"/>
               </w:rPr>
-              <w:t>index.html</w:t>
+              <w:t>gemini_provider.py</w:t>
             </w:r>
           </w:p>
         </w:tc>
@@ -13181,7 +14202,7 @@
                 <w:color w:val="0F172A"/>
                 <w:sz w:val="19"/>
               </w:rPr>
-              <w:t>Web Simulator</w:t>
+              <w:t>FastAPI Service</w:t>
             </w:r>
           </w:p>
         </w:tc>
@@ -13206,7 +14227,87 @@
                 <w:color w:val="0F172A"/>
                 <w:sz w:val="19"/>
               </w:rPr>
-              <w:t>Interactive phone simulator previewing full app in desktop browsers</w:t>
+              <w:t>Google Gemini 3.6 Flash integration for live dialogue &amp; summary</w:t>
+            </w:r>
+          </w:p>
+        </w:tc>
+      </w:tr>
+      <w:tr>
+        <w:trPr>
+          <w:cantSplit/>
+        </w:trPr>
+        <w:tc>
+          <w:tcPr>
+            <w:tcW w:type="dxa" w:w="3168"/>
+            <w:shd w:fill="FFFFFF"/>
+            <w:tcMar>
+              <w:top w:w="100" w:type="dxa"/>
+              <w:bottom w:w="100" w:type="dxa"/>
+              <w:left w:w="120" w:type="dxa"/>
+              <w:right w:w="120" w:type="dxa"/>
+            </w:tcMar>
+          </w:tcPr>
+          <w:p>
+            <w:pPr>
+              <w:spacing w:after="0" w:line="264" w:lineRule="auto"/>
+            </w:pPr>
+            <w:r>
+              <w:rPr>
+                <w:rFonts w:ascii="Calibri" w:hAnsi="Calibri"/>
+                <w:color w:val="0F172A"/>
+                <w:sz w:val="19"/>
+              </w:rPr>
+              <w:t>index.html</w:t>
+            </w:r>
+          </w:p>
+        </w:tc>
+        <w:tc>
+          <w:tcPr>
+            <w:tcW w:type="dxa" w:w="2592"/>
+            <w:shd w:fill="FFFFFF"/>
+            <w:tcMar>
+              <w:top w:w="100" w:type="dxa"/>
+              <w:bottom w:w="100" w:type="dxa"/>
+              <w:left w:w="120" w:type="dxa"/>
+              <w:right w:w="120" w:type="dxa"/>
+            </w:tcMar>
+          </w:tcPr>
+          <w:p>
+            <w:pPr>
+              <w:spacing w:after="0" w:line="264" w:lineRule="auto"/>
+            </w:pPr>
+            <w:r>
+              <w:rPr>
+                <w:rFonts w:ascii="Calibri" w:hAnsi="Calibri"/>
+                <w:color w:val="0F172A"/>
+                <w:sz w:val="19"/>
+              </w:rPr>
+              <w:t>Web Simulator</w:t>
+            </w:r>
+          </w:p>
+        </w:tc>
+        <w:tc>
+          <w:tcPr>
+            <w:tcW w:type="dxa" w:w="3600"/>
+            <w:shd w:fill="FFFFFF"/>
+            <w:tcMar>
+              <w:top w:w="100" w:type="dxa"/>
+              <w:bottom w:w="100" w:type="dxa"/>
+              <w:left w:w="120" w:type="dxa"/>
+              <w:right w:w="120" w:type="dxa"/>
+            </w:tcMar>
+          </w:tcPr>
+          <w:p>
+            <w:pPr>
+              <w:spacing w:after="0" w:line="264" w:lineRule="auto"/>
+            </w:pPr>
+            <w:r>
+              <w:rPr>
+                <w:rFonts w:ascii="Calibri" w:hAnsi="Calibri"/>
+                <w:color w:val="0F172A"/>
+                <w:sz w:val="19"/>
+              </w:rPr>
+              <w:t>Interactive phone simulator previewing full app with Web Speech mic</w:t>
             </w:r>
           </w:p>
         </w:tc>
@@ -14000,7 +15101,7 @@
                 <w:color w:val="0F172A"/>
                 <w:sz w:val="19"/>
               </w:rPr>
-              <w:t>Web framework for authentication endpoints</w:t>
+              <w:t>Web framework for authentication &amp; spam endpoints</w:t>
             </w:r>
           </w:p>
         </w:tc>
@@ -14450,7 +15551,7 @@
                 <w:color w:val="0F172A"/>
                 <w:sz w:val="19"/>
               </w:rPr>
-              <w:t>uvicorn</w:t>
+              <w:t>httpx</w:t>
             </w:r>
           </w:p>
         </w:tc>
@@ -14475,7 +15576,7 @@
                 <w:color w:val="0F172A"/>
                 <w:sz w:val="19"/>
               </w:rPr>
-              <w:t>0.30.1</w:t>
+              <w:t>0.27.0</w:t>
             </w:r>
           </w:p>
         </w:tc>
@@ -14508,6 +15609,111 @@
           <w:tcPr>
             <w:tcW w:type="dxa" w:w="3312"/>
             <w:shd w:fill="FFFFFF"/>
+            <w:tcMar>
+              <w:top w:w="100" w:type="dxa"/>
+              <w:bottom w:w="100" w:type="dxa"/>
+              <w:left w:w="120" w:type="dxa"/>
+              <w:right w:w="120" w:type="dxa"/>
+            </w:tcMar>
+          </w:tcPr>
+          <w:p>
+            <w:pPr>
+              <w:spacing w:after="0" w:line="264" w:lineRule="auto"/>
+            </w:pPr>
+            <w:r>
+              <w:rPr>
+                <w:rFonts w:ascii="Calibri" w:hAnsi="Calibri"/>
+                <w:color w:val="0F172A"/>
+                <w:sz w:val="19"/>
+              </w:rPr>
+              <w:t>Asynchronous HTTP client for Google Gemini REST API</w:t>
+            </w:r>
+          </w:p>
+        </w:tc>
+      </w:tr>
+      <w:tr>
+        <w:trPr>
+          <w:cantSplit/>
+        </w:trPr>
+        <w:tc>
+          <w:tcPr>
+            <w:tcW w:type="dxa" w:w="2592"/>
+            <w:shd w:fill="F8FAFC"/>
+            <w:tcMar>
+              <w:top w:w="100" w:type="dxa"/>
+              <w:bottom w:w="100" w:type="dxa"/>
+              <w:left w:w="120" w:type="dxa"/>
+              <w:right w:w="120" w:type="dxa"/>
+            </w:tcMar>
+          </w:tcPr>
+          <w:p>
+            <w:pPr>
+              <w:spacing w:after="0" w:line="264" w:lineRule="auto"/>
+            </w:pPr>
+            <w:r>
+              <w:rPr>
+                <w:rFonts w:ascii="Calibri" w:hAnsi="Calibri"/>
+                <w:color w:val="0F172A"/>
+                <w:sz w:val="19"/>
+              </w:rPr>
+              <w:t>uvicorn</w:t>
+            </w:r>
+          </w:p>
+        </w:tc>
+        <w:tc>
+          <w:tcPr>
+            <w:tcW w:type="dxa" w:w="1728"/>
+            <w:shd w:fill="F8FAFC"/>
+            <w:tcMar>
+              <w:top w:w="100" w:type="dxa"/>
+              <w:bottom w:w="100" w:type="dxa"/>
+              <w:left w:w="120" w:type="dxa"/>
+              <w:right w:w="120" w:type="dxa"/>
+            </w:tcMar>
+          </w:tcPr>
+          <w:p>
+            <w:pPr>
+              <w:spacing w:after="0" w:line="264" w:lineRule="auto"/>
+            </w:pPr>
+            <w:r>
+              <w:rPr>
+                <w:rFonts w:ascii="Calibri" w:hAnsi="Calibri"/>
+                <w:color w:val="0F172A"/>
+                <w:sz w:val="19"/>
+              </w:rPr>
+              <w:t>0.30.1</w:t>
+            </w:r>
+          </w:p>
+        </w:tc>
+        <w:tc>
+          <w:tcPr>
+            <w:tcW w:type="dxa" w:w="1728"/>
+            <w:shd w:fill="F8FAFC"/>
+            <w:tcMar>
+              <w:top w:w="100" w:type="dxa"/>
+              <w:bottom w:w="100" w:type="dxa"/>
+              <w:left w:w="120" w:type="dxa"/>
+              <w:right w:w="120" w:type="dxa"/>
+            </w:tcMar>
+          </w:tcPr>
+          <w:p>
+            <w:pPr>
+              <w:spacing w:after="0" w:line="264" w:lineRule="auto"/>
+            </w:pPr>
+            <w:r>
+              <w:rPr>
+                <w:rFonts w:ascii="Calibri" w:hAnsi="Calibri"/>
+                <w:color w:val="0F172A"/>
+                <w:sz w:val="19"/>
+              </w:rPr>
+              <w:t>Python</w:t>
+            </w:r>
+          </w:p>
+        </w:tc>
+        <w:tc>
+          <w:tcPr>
+            <w:tcW w:type="dxa" w:w="3312"/>
+            <w:shd w:fill="F8FAFC"/>
             <w:tcMar>
               <w:top w:w="100" w:type="dxa"/>
               <w:bottom w:w="100" w:type="dxa"/>
@@ -14692,7 +15898,7 @@
                 <w:color w:val="0F172A"/>
                 <w:sz w:val="19"/>
               </w:rPr>
-              <w:t>android.permission.RECORD_AUDIO</w:t>
+              <w:t>android.permission.READ_CONTACTS</w:t>
             </w:r>
           </w:p>
         </w:tc>
@@ -14742,7 +15948,7 @@
                 <w:color w:val="0F172A"/>
                 <w:sz w:val="19"/>
               </w:rPr>
-              <w:t>Required to capture user voice during live screening audio interaction</w:t>
+              <w:t>Required to access device contacts and whitelist known callers from AI screening</w:t>
             </w:r>
           </w:p>
         </w:tc>
@@ -14772,7 +15978,7 @@
                 <w:color w:val="0F172A"/>
                 <w:sz w:val="19"/>
               </w:rPr>
-              <w:t>android.permission.INTERNET</w:t>
+              <w:t>android.permission.ACCESS_FINE_LOCATION</w:t>
             </w:r>
           </w:p>
         </w:tc>
@@ -14797,7 +16003,7 @@
                 <w:color w:val="0F172A"/>
                 <w:sz w:val="19"/>
               </w:rPr>
-              <w:t>Normal</w:t>
+              <w:t>Dangerous</w:t>
             </w:r>
           </w:p>
         </w:tc>
@@ -14822,7 +16028,7 @@
                 <w:color w:val="0F172A"/>
                 <w:sz w:val="19"/>
               </w:rPr>
-              <w:t>Required for API communication with cloud backend and AI engine</w:t>
+              <w:t>Required to capture GPS coordinates for delivery parcel drop-off guidance</w:t>
             </w:r>
           </w:p>
         </w:tc>
@@ -14852,7 +16058,7 @@
                 <w:color w:val="0F172A"/>
                 <w:sz w:val="19"/>
               </w:rPr>
-              <w:t>android.permission.POST_NOTIFICATIONS</w:t>
+              <w:t>android.permission.ACCESS_COARSE_LOCATION</w:t>
             </w:r>
           </w:p>
         </w:tc>
@@ -14902,7 +16108,7 @@
                 <w:color w:val="0F172A"/>
                 <w:sz w:val="19"/>
               </w:rPr>
-              <w:t>Required on Android 13+ (API 33+) to alert user of screened calls</w:t>
+              <w:t>Approximate network-based location fallback for city/neighbourhood detection</w:t>
             </w:r>
           </w:p>
         </w:tc>
@@ -14932,7 +16138,7 @@
                 <w:color w:val="0F172A"/>
                 <w:sz w:val="19"/>
               </w:rPr>
-              <w:t>READ_PHONE_STATE (Removed)</w:t>
+              <w:t>android.permission.RECORD_AUDIO</w:t>
             </w:r>
           </w:p>
         </w:tc>
@@ -14957,7 +16163,7 @@
                 <w:color w:val="0F172A"/>
                 <w:sz w:val="19"/>
               </w:rPr>
-              <w:t>Excluded</w:t>
+              <w:t>Dangerous</w:t>
             </w:r>
           </w:p>
         </w:tc>
@@ -14982,7 +16188,247 @@
                 <w:color w:val="0F172A"/>
                 <w:sz w:val="19"/>
               </w:rPr>
-              <w:t>Explicitly removed via tools:node='remove' to preserve user privacy</w:t>
+              <w:t>Required to capture caller/user voice during real-time screening audio interaction</w:t>
+            </w:r>
+          </w:p>
+        </w:tc>
+      </w:tr>
+      <w:tr>
+        <w:trPr>
+          <w:cantSplit/>
+        </w:trPr>
+        <w:tc>
+          <w:tcPr>
+            <w:tcW w:type="dxa" w:w="2592"/>
+            <w:shd w:fill="FFFFFF"/>
+            <w:tcMar>
+              <w:top w:w="100" w:type="dxa"/>
+              <w:bottom w:w="100" w:type="dxa"/>
+              <w:left w:w="120" w:type="dxa"/>
+              <w:right w:w="120" w:type="dxa"/>
+            </w:tcMar>
+          </w:tcPr>
+          <w:p>
+            <w:pPr>
+              <w:spacing w:after="0" w:line="264" w:lineRule="auto"/>
+            </w:pPr>
+            <w:r>
+              <w:rPr>
+                <w:rFonts w:ascii="Calibri" w:hAnsi="Calibri"/>
+                <w:color w:val="0F172A"/>
+                <w:sz w:val="19"/>
+              </w:rPr>
+              <w:t>android.permission.READ_PHONE_STATE</w:t>
+            </w:r>
+          </w:p>
+        </w:tc>
+        <w:tc>
+          <w:tcPr>
+            <w:tcW w:type="dxa" w:w="1728"/>
+            <w:shd w:fill="FFFFFF"/>
+            <w:tcMar>
+              <w:top w:w="100" w:type="dxa"/>
+              <w:bottom w:w="100" w:type="dxa"/>
+              <w:left w:w="120" w:type="dxa"/>
+              <w:right w:w="120" w:type="dxa"/>
+            </w:tcMar>
+          </w:tcPr>
+          <w:p>
+            <w:pPr>
+              <w:spacing w:after="0" w:line="264" w:lineRule="auto"/>
+            </w:pPr>
+            <w:r>
+              <w:rPr>
+                <w:rFonts w:ascii="Calibri" w:hAnsi="Calibri"/>
+                <w:color w:val="0F172A"/>
+                <w:sz w:val="19"/>
+              </w:rPr>
+              <w:t>Dangerous</w:t>
+            </w:r>
+          </w:p>
+        </w:tc>
+        <w:tc>
+          <w:tcPr>
+            <w:tcW w:type="dxa" w:w="5040"/>
+            <w:shd w:fill="FFFFFF"/>
+            <w:tcMar>
+              <w:top w:w="100" w:type="dxa"/>
+              <w:bottom w:w="100" w:type="dxa"/>
+              <w:left w:w="120" w:type="dxa"/>
+              <w:right w:w="120" w:type="dxa"/>
+            </w:tcMar>
+          </w:tcPr>
+          <w:p>
+            <w:pPr>
+              <w:spacing w:after="0" w:line="264" w:lineRule="auto"/>
+            </w:pPr>
+            <w:r>
+              <w:rPr>
+                <w:rFonts w:ascii="Calibri" w:hAnsi="Calibri"/>
+                <w:color w:val="0F172A"/>
+                <w:sz w:val="19"/>
+              </w:rPr>
+              <w:t>Required to identify incoming phone numbers and trigger screening UI</w:t>
+            </w:r>
+          </w:p>
+        </w:tc>
+      </w:tr>
+      <w:tr>
+        <w:trPr>
+          <w:cantSplit/>
+        </w:trPr>
+        <w:tc>
+          <w:tcPr>
+            <w:tcW w:type="dxa" w:w="2592"/>
+            <w:shd w:fill="F8FAFC"/>
+            <w:tcMar>
+              <w:top w:w="100" w:type="dxa"/>
+              <w:bottom w:w="100" w:type="dxa"/>
+              <w:left w:w="120" w:type="dxa"/>
+              <w:right w:w="120" w:type="dxa"/>
+            </w:tcMar>
+          </w:tcPr>
+          <w:p>
+            <w:pPr>
+              <w:spacing w:after="0" w:line="264" w:lineRule="auto"/>
+            </w:pPr>
+            <w:r>
+              <w:rPr>
+                <w:rFonts w:ascii="Calibri" w:hAnsi="Calibri"/>
+                <w:color w:val="0F172A"/>
+                <w:sz w:val="19"/>
+              </w:rPr>
+              <w:t>android.permission.INTERNET</w:t>
+            </w:r>
+          </w:p>
+        </w:tc>
+        <w:tc>
+          <w:tcPr>
+            <w:tcW w:type="dxa" w:w="1728"/>
+            <w:shd w:fill="F8FAFC"/>
+            <w:tcMar>
+              <w:top w:w="100" w:type="dxa"/>
+              <w:bottom w:w="100" w:type="dxa"/>
+              <w:left w:w="120" w:type="dxa"/>
+              <w:right w:w="120" w:type="dxa"/>
+            </w:tcMar>
+          </w:tcPr>
+          <w:p>
+            <w:pPr>
+              <w:spacing w:after="0" w:line="264" w:lineRule="auto"/>
+            </w:pPr>
+            <w:r>
+              <w:rPr>
+                <w:rFonts w:ascii="Calibri" w:hAnsi="Calibri"/>
+                <w:color w:val="0F172A"/>
+                <w:sz w:val="19"/>
+              </w:rPr>
+              <w:t>Normal</w:t>
+            </w:r>
+          </w:p>
+        </w:tc>
+        <w:tc>
+          <w:tcPr>
+            <w:tcW w:type="dxa" w:w="5040"/>
+            <w:shd w:fill="F8FAFC"/>
+            <w:tcMar>
+              <w:top w:w="100" w:type="dxa"/>
+              <w:bottom w:w="100" w:type="dxa"/>
+              <w:left w:w="120" w:type="dxa"/>
+              <w:right w:w="120" w:type="dxa"/>
+            </w:tcMar>
+          </w:tcPr>
+          <w:p>
+            <w:pPr>
+              <w:spacing w:after="0" w:line="264" w:lineRule="auto"/>
+            </w:pPr>
+            <w:r>
+              <w:rPr>
+                <w:rFonts w:ascii="Calibri" w:hAnsi="Calibri"/>
+                <w:color w:val="0F172A"/>
+                <w:sz w:val="19"/>
+              </w:rPr>
+              <w:t>Required for API communication with cloud backend, Gemini AI, and MongoDB Atlas</w:t>
+            </w:r>
+          </w:p>
+        </w:tc>
+      </w:tr>
+      <w:tr>
+        <w:trPr>
+          <w:cantSplit/>
+        </w:trPr>
+        <w:tc>
+          <w:tcPr>
+            <w:tcW w:type="dxa" w:w="2592"/>
+            <w:shd w:fill="FFFFFF"/>
+            <w:tcMar>
+              <w:top w:w="100" w:type="dxa"/>
+              <w:bottom w:w="100" w:type="dxa"/>
+              <w:left w:w="120" w:type="dxa"/>
+              <w:right w:w="120" w:type="dxa"/>
+            </w:tcMar>
+          </w:tcPr>
+          <w:p>
+            <w:pPr>
+              <w:spacing w:after="0" w:line="264" w:lineRule="auto"/>
+            </w:pPr>
+            <w:r>
+              <w:rPr>
+                <w:rFonts w:ascii="Calibri" w:hAnsi="Calibri"/>
+                <w:color w:val="0F172A"/>
+                <w:sz w:val="19"/>
+              </w:rPr>
+              <w:t>android.permission.POST_NOTIFICATIONS</w:t>
+            </w:r>
+          </w:p>
+        </w:tc>
+        <w:tc>
+          <w:tcPr>
+            <w:tcW w:type="dxa" w:w="1728"/>
+            <w:shd w:fill="FFFFFF"/>
+            <w:tcMar>
+              <w:top w:w="100" w:type="dxa"/>
+              <w:bottom w:w="100" w:type="dxa"/>
+              <w:left w:w="120" w:type="dxa"/>
+              <w:right w:w="120" w:type="dxa"/>
+            </w:tcMar>
+          </w:tcPr>
+          <w:p>
+            <w:pPr>
+              <w:spacing w:after="0" w:line="264" w:lineRule="auto"/>
+            </w:pPr>
+            <w:r>
+              <w:rPr>
+                <w:rFonts w:ascii="Calibri" w:hAnsi="Calibri"/>
+                <w:color w:val="0F172A"/>
+                <w:sz w:val="19"/>
+              </w:rPr>
+              <w:t>Dangerous</w:t>
+            </w:r>
+          </w:p>
+        </w:tc>
+        <w:tc>
+          <w:tcPr>
+            <w:tcW w:type="dxa" w:w="5040"/>
+            <w:shd w:fill="FFFFFF"/>
+            <w:tcMar>
+              <w:top w:w="100" w:type="dxa"/>
+              <w:bottom w:w="100" w:type="dxa"/>
+              <w:left w:w="120" w:type="dxa"/>
+              <w:right w:w="120" w:type="dxa"/>
+            </w:tcMar>
+          </w:tcPr>
+          <w:p>
+            <w:pPr>
+              <w:spacing w:after="0" w:line="264" w:lineRule="auto"/>
+            </w:pPr>
+            <w:r>
+              <w:rPr>
+                <w:rFonts w:ascii="Calibri" w:hAnsi="Calibri"/>
+                <w:color w:val="0F172A"/>
+                <w:sz w:val="19"/>
+              </w:rPr>
+              <w:t>Required on Android 13+ (API 33+) to alert user of screened calls and summaries</w:t>
             </w:r>
           </w:p>
         </w:tc>
@@ -15913,7 +17359,7 @@
                 <w:color w:val="0F172A"/>
                 <w:sz w:val="19"/>
               </w:rPr>
-              <w:t>'You' Settings Hub</w:t>
+              <w:t>Contacts Whitelisting</w:t>
             </w:r>
           </w:p>
         </w:tc>
@@ -15964,7 +17410,7 @@
                 <w:color w:val="0F172A"/>
                 <w:sz w:val="19"/>
               </w:rPr>
-              <w:t>All 9 settings screens and dialogs completely implemented</w:t>
+              <w:t>Queries device ContactsContract to let known contacts ring directly</w:t>
             </w:r>
           </w:p>
         </w:tc>
@@ -15994,7 +17440,7 @@
                 <w:color w:val="0F172A"/>
                 <w:sz w:val="19"/>
               </w:rPr>
-              <w:t>Simulated Screening</w:t>
+              <w:t>Live GPS &amp; Addresses</w:t>
             </w:r>
           </w:p>
         </w:tc>
@@ -16045,7 +17491,7 @@
                 <w:color w:val="0F172A"/>
                 <w:sz w:val="19"/>
               </w:rPr>
-              <w:t>SimulatorCallProvider mock engine enables realistic screening testing</w:t>
+              <w:t>Silent GPS capture + OpenStreetMap reverse-geocoding street address</w:t>
             </w:r>
           </w:p>
         </w:tc>
@@ -16075,7 +17521,7 @@
                 <w:color w:val="0F172A"/>
                 <w:sz w:val="19"/>
               </w:rPr>
-              <w:t>Cellular CallScreening</w:t>
+              <w:t>Global Spam Registry</w:t>
             </w:r>
           </w:p>
         </w:tc>
@@ -16098,10 +17544,10 @@
               <w:rPr>
                 <w:rFonts w:ascii="Calibri" w:hAnsi="Calibri"/>
                 <w:b/>
-                <w:color w:val="DC2626"/>
-                <w:sz w:val="19"/>
-              </w:rPr>
-              <w:t>PLANNED</w:t>
+                <w:color w:val="059669"/>
+                <w:sz w:val="19"/>
+              </w:rPr>
+              <w:t>IMPLEMENTED</w:t>
             </w:r>
           </w:p>
         </w:tc>
@@ -16126,7 +17572,7 @@
                 <w:color w:val="0F172A"/>
                 <w:sz w:val="19"/>
               </w:rPr>
-              <w:t>Real cellular carrier interception via Telecom framework is not yet implemented</w:t>
+              <w:t>Crowdsourced SpamNumber model in MongoDB Atlas with UI Spam filter</w:t>
             </w:r>
           </w:p>
         </w:tc>
@@ -16156,7 +17602,7 @@
                 <w:color w:val="0F172A"/>
                 <w:sz w:val="19"/>
               </w:rPr>
-              <w:t>Verified Spam DB</w:t>
+              <w:t>Gemini AI Screening</w:t>
             </w:r>
           </w:p>
         </w:tc>
@@ -16179,10 +17625,10 @@
               <w:rPr>
                 <w:rFonts w:ascii="Calibri" w:hAnsi="Calibri"/>
                 <w:b/>
-                <w:color w:val="DC2626"/>
-                <w:sz w:val="19"/>
-              </w:rPr>
-              <w:t>NOT IMPLEMENTED</w:t>
+                <w:color w:val="059669"/>
+                <w:sz w:val="19"/>
+              </w:rPr>
+              <w:t>IMPLEMENTED</w:t>
             </w:r>
           </w:p>
         </w:tc>
@@ -16207,7 +17653,7 @@
                 <w:color w:val="0F172A"/>
                 <w:sz w:val="19"/>
               </w:rPr>
-              <w:t>No production Indian spam dataset integrated; test synthetic data only</w:t>
+              <w:t>Google Gemini 3.6 Flash (gemini-3.6-flash) cloud inference active</w:t>
             </w:r>
           </w:p>
         </w:tc>
@@ -16237,7 +17683,7 @@
                 <w:color w:val="0F172A"/>
                 <w:sz w:val="19"/>
               </w:rPr>
-              <w:t>Multilingual STT/TTS</w:t>
+              <w:t>'You' Settings Hub</w:t>
             </w:r>
           </w:p>
         </w:tc>
@@ -16260,10 +17706,10 @@
               <w:rPr>
                 <w:rFonts w:ascii="Calibri" w:hAnsi="Calibri"/>
                 <w:b/>
-                <w:color w:val="D97706"/>
-                <w:sz w:val="19"/>
-              </w:rPr>
-              <w:t>PARTIAL</w:t>
+                <w:color w:val="059669"/>
+                <w:sz w:val="19"/>
+              </w:rPr>
+              <w:t>IMPLEMENTED</w:t>
             </w:r>
           </w:p>
         </w:tc>
@@ -16288,7 +17734,88 @@
                 <w:color w:val="0F172A"/>
                 <w:sz w:val="19"/>
               </w:rPr>
-              <w:t>Configured for en-US; regional Indian languages (Hindi, Telugu, Tamil) planned</w:t>
+              <w:t>All settings screens, address manager, and instructions manager active</w:t>
+            </w:r>
+          </w:p>
+        </w:tc>
+      </w:tr>
+      <w:tr>
+        <w:trPr>
+          <w:cantSplit/>
+        </w:trPr>
+        <w:tc>
+          <w:tcPr>
+            <w:tcW w:type="dxa" w:w="2880"/>
+            <w:shd w:fill="F8FAFC"/>
+            <w:tcMar>
+              <w:top w:w="100" w:type="dxa"/>
+              <w:bottom w:w="100" w:type="dxa"/>
+              <w:left w:w="120" w:type="dxa"/>
+              <w:right w:w="120" w:type="dxa"/>
+            </w:tcMar>
+          </w:tcPr>
+          <w:p>
+            <w:pPr>
+              <w:spacing w:after="0" w:line="264" w:lineRule="auto"/>
+            </w:pPr>
+            <w:r>
+              <w:rPr>
+                <w:rFonts w:ascii="Calibri" w:hAnsi="Calibri"/>
+                <w:color w:val="0F172A"/>
+                <w:sz w:val="19"/>
+              </w:rPr>
+              <w:t>Cellular CallScreening</w:t>
+            </w:r>
+          </w:p>
+        </w:tc>
+        <w:tc>
+          <w:tcPr>
+            <w:tcW w:type="dxa" w:w="2160"/>
+            <w:shd w:fill="F8FAFC"/>
+            <w:tcMar>
+              <w:top w:w="100" w:type="dxa"/>
+              <w:bottom w:w="100" w:type="dxa"/>
+              <w:left w:w="120" w:type="dxa"/>
+              <w:right w:w="120" w:type="dxa"/>
+            </w:tcMar>
+          </w:tcPr>
+          <w:p>
+            <w:pPr>
+              <w:spacing w:after="0" w:line="264" w:lineRule="auto"/>
+            </w:pPr>
+            <w:r>
+              <w:rPr>
+                <w:rFonts w:ascii="Calibri" w:hAnsi="Calibri"/>
+                <w:b/>
+                <w:color w:val="DC2626"/>
+                <w:sz w:val="19"/>
+              </w:rPr>
+              <w:t>PLANNED</w:t>
+            </w:r>
+          </w:p>
+        </w:tc>
+        <w:tc>
+          <w:tcPr>
+            <w:tcW w:type="dxa" w:w="4320"/>
+            <w:shd w:fill="F8FAFC"/>
+            <w:tcMar>
+              <w:top w:w="100" w:type="dxa"/>
+              <w:bottom w:w="100" w:type="dxa"/>
+              <w:left w:w="120" w:type="dxa"/>
+              <w:right w:w="120" w:type="dxa"/>
+            </w:tcMar>
+          </w:tcPr>
+          <w:p>
+            <w:pPr>
+              <w:spacing w:after="0" w:line="264" w:lineRule="auto"/>
+            </w:pPr>
+            <w:r>
+              <w:rPr>
+                <w:rFonts w:ascii="Calibri" w:hAnsi="Calibri"/>
+                <w:color w:val="0F172A"/>
+                <w:sz w:val="19"/>
+              </w:rPr>
+              <w:t>Real cellular carrier interception via Telecom framework is planned</w:t>
             </w:r>
           </w:p>
         </w:tc>
@@ -16343,13 +17870,13 @@
           <w:b/>
           <w:color w:val="0F172A"/>
         </w:rPr>
-        <w:t>Phase 2: Verified Spam Threat Feed:</w:t>
+        <w:t>Phase 2: National Registry Synergies:</w:t>
       </w:r>
       <w:r>
         <w:rPr>
           <w:color w:val="0F172A"/>
         </w:rPr>
-        <w:t xml:space="preserve"> Integrate verified national DND/spam number registries with real-time reputation lookups.</w:t>
+        <w:t xml:space="preserve"> Integrate verified national DND/TRAI registries with real-time reputation lookups.</w:t>
       </w:r>
     </w:p>
     <w:p>
@@ -16368,7 +17895,7 @@
         <w:rPr>
           <w:color w:val="0F172A"/>
         </w:rPr>
-        <w:t xml:space="preserve"> Add speech recognition and synthesis support for major regional languages.</w:t>
+        <w:t xml:space="preserve"> Add speech recognition and synthesis support for major regional Indian languages (Hindi, Telugu, Tamil).</w:t>
       </w:r>
     </w:p>
     <w:p>
@@ -16447,13 +17974,32 @@
           <w:b/>
           <w:color w:val="0F172A"/>
         </w:rPr>
+        <w:t>Permission Declarations:</w:t>
+      </w:r>
+      <w:r>
+        <w:rPr>
+          <w:color w:val="0F172A"/>
+        </w:rPr>
+        <w:t xml:space="preserve"> READ_CONTACTS (Whitelisting known callers), ACCESS_FINE_LOCATION (Delivery guidance), RECORD_AUDIO (Voice screening).</w:t>
+      </w:r>
+    </w:p>
+    <w:p>
+      <w:pPr>
+        <w:pStyle w:val="ListBullet"/>
+        <w:spacing w:after="80" w:line="276" w:lineRule="auto"/>
+      </w:pPr>
+      <w:r>
+        <w:rPr>
+          <w:b/>
+          <w:color w:val="0F172A"/>
+        </w:rPr>
         <w:t>Privacy Policy Hosting:</w:t>
       </w:r>
       <w:r>
         <w:rPr>
           <w:color w:val="0F172A"/>
         </w:rPr>
-        <w:t xml:space="preserve"> A published Privacy Policy URL detailing microphone and account data handling must be linked.</w:t>
+        <w:t xml:space="preserve"> A published Privacy Policy URL detailing microphone, contact list, and account data handling must be linked.</w:t>
       </w:r>
     </w:p>
     <w:p>
@@ -17180,6 +18726,63 @@
           <w:b/>
           <w:color w:val="0F172A"/>
         </w:rPr>
+        <w:t>Official GitHub Repository:</w:t>
+      </w:r>
+      <w:r>
+        <w:rPr>
+          <w:color w:val="0F172A"/>
+        </w:rPr>
+        <w:t xml:space="preserve"> https://github.com/sanjana71006/CallAgent</w:t>
+      </w:r>
+    </w:p>
+    <w:p>
+      <w:pPr>
+        <w:pStyle w:val="ListBullet"/>
+        <w:spacing w:after="80" w:line="276" w:lineRule="auto"/>
+      </w:pPr>
+      <w:r>
+        <w:rPr>
+          <w:b/>
+          <w:color w:val="0F172A"/>
+        </w:rPr>
+        <w:t>150-Char Synopsis:</w:t>
+      </w:r>
+      <w:r>
+        <w:rPr>
+          <w:color w:val="0F172A"/>
+        </w:rPr>
+        <w:t xml:space="preserve"> CallMate AI is a privacy-first call assistant that screens unknown calls, transcribes voice live, blocks spam, and guides couriers with Google Gemini.</w:t>
+      </w:r>
+    </w:p>
+    <w:p>
+      <w:pPr>
+        <w:pStyle w:val="ListBullet"/>
+        <w:spacing w:after="80" w:line="276" w:lineRule="auto"/>
+      </w:pPr>
+      <w:r>
+        <w:rPr>
+          <w:b/>
+          <w:color w:val="0F172A"/>
+        </w:rPr>
+        <w:t>Standalone APK File:</w:t>
+      </w:r>
+      <w:r>
+        <w:rPr>
+          <w:color w:val="0F172A"/>
+        </w:rPr>
+        <w:t xml:space="preserve"> CallMate_AI_v1.0.0_debug.apk (18.8 MB)</w:t>
+      </w:r>
+    </w:p>
+    <w:p>
+      <w:pPr>
+        <w:pStyle w:val="ListBullet"/>
+        <w:spacing w:after="80" w:line="276" w:lineRule="auto"/>
+      </w:pPr>
+      <w:r>
+        <w:rPr>
+          <w:b/>
+          <w:color w:val="0F172A"/>
+        </w:rPr>
         <w:t>Android Package:</w:t>
       </w:r>
       <w:r>
@@ -17218,13 +18821,13 @@
           <w:b/>
           <w:color w:val="0F172A"/>
         </w:rPr>
-        <w:t>Backend Server:</w:t>
+        <w:t>Cloud Backend:</w:t>
       </w:r>
       <w:r>
         <w:rPr>
           <w:color w:val="0F172A"/>
         </w:rPr>
-        <w:t xml:space="preserve"> Node.js (Express) on Port 5000 (Cloud Auth &amp; User Management)</w:t>
+        <w:t xml:space="preserve"> Node.js (Express) on Port 5000 (Auth, Location, Addresses, Global Spam)</w:t>
       </w:r>
     </w:p>
     <w:p>
@@ -17243,7 +18846,7 @@
         <w:rPr>
           <w:color w:val="0F172A"/>
         </w:rPr>
-        <w:t xml:space="preserve"> Python (FastAPI) on Port 8000 (Ollama qwen2.5:0.5b / Mock)</w:t>
+        <w:t xml:space="preserve"> Python (FastAPI) on Port 8000 (Google Gemini 3.6 Flash / Ollama / Mock)</w:t>
       </w:r>
     </w:p>
     <w:p>
@@ -17300,7 +18903,7 @@
         <w:rPr>
           <w:color w:val="0F172A"/>
         </w:rPr>
-        <w:t xml:space="preserve"> Fully functional local client + cloud auth + AI engine; Carrier Telecom integration planned</w:t>
+        <w:t xml:space="preserve"> Fully functional native Android client with Contacts &amp; GPS + Cloud Backend + Gemini AI</w:t>
       </w:r>
     </w:p>
     <w:p>

</xml_diff>